<commit_message>
Added insights to documentation
</commit_message>
<xml_diff>
--- a/docs/Project_Documentation.docx
+++ b/docs/Project_Documentation.docx
@@ -259,39 +259,7 @@
           <w:sz w:val="28"/>
           <w:szCs w:val="28"/>
         </w:rPr>
-        <w:t xml:space="preserve">This paper contains summary of many papers I think 240 and a detailed study of 61 among them. It discusses about which type of model dominates and what are the regions of improvements. It shows Boosting models perform great and XG Boost wins and even leave behind ANN (deep learning framework) in case of tabular data. And once the data type changes, everything changes. Therefore, DL approaches came into effect as traditional ML is not able to capture relationship as data start to become complex. There DL approaches solve the complex data problem but comes with limitations like powerful hardware requirements and black box problem. Therefore, for my use case, XG Boost will serve best. Area of improvement includes integrating XAI as of now too, it is underrepresented in production. Taking care of Concept Drift and data Imbalance. In the whole paper, approaches are discussed, for ML and DL in the time frame of 2020-2024. At last, what I get to know is to use ensemble methods and use correct metrics and previously I had decided to use LSTM, but it will make the project complex and requires sequential data and not tabular data. So, later decided to drop it. Traditional models like </w:t>
-      </w:r>
-      <w:proofErr w:type="spellStart"/>
-      <w:r>
-        <w:rPr>
-          <w:sz w:val="28"/>
-          <w:szCs w:val="28"/>
-        </w:rPr>
-        <w:t>kNN</w:t>
-      </w:r>
-      <w:proofErr w:type="spellEnd"/>
-      <w:r>
-        <w:rPr>
-          <w:sz w:val="28"/>
-          <w:szCs w:val="28"/>
-        </w:rPr>
-        <w:t xml:space="preserve"> and Naïve </w:t>
-      </w:r>
-      <w:proofErr w:type="spellStart"/>
-      <w:r>
-        <w:rPr>
-          <w:sz w:val="28"/>
-          <w:szCs w:val="28"/>
-        </w:rPr>
-        <w:t>Baiyes</w:t>
-      </w:r>
-      <w:proofErr w:type="spellEnd"/>
-      <w:r>
-        <w:rPr>
-          <w:sz w:val="28"/>
-          <w:szCs w:val="28"/>
-        </w:rPr>
-        <w:t xml:space="preserve"> are also not good, while SVM can be average but ensemble techniques will dominate.</w:t>
+        <w:t>This paper contains summary of many papers I think 240 and a detailed study of 61 among them. It discusses about which type of model dominates and what are the regions of improvements. It shows Boosting models perform great and XG Boost wins and even leave behind ANN (deep learning framework) in case of tabular data. And once the data type changes, everything changes. Therefore, DL approaches came into effect as traditional ML is not able to capture relationship as data start to become complex. There DL approaches solve the complex data problem but comes with limitations like powerful hardware requirements and black box problem. Therefore, for my use case, XG Boost will serve best. Area of improvement includes integrating XAI as of now too, it is underrepresented in production. Taking care of Concept Drift and data Imbalance. In the whole paper, approaches are discussed, for ML and DL in the time frame of 2020-2024. At last, what I get to know is to use ensemble methods and use correct metrics and previously I had decided to use LSTM, but it will make the project complex and requires sequential data and not tabular data. So, later decided to drop it. Traditional models like kNN and Naïve Baiyes are also not good, while SVM can be average but ensemble techniques will dominate.</w:t>
       </w:r>
     </w:p>
     <w:p>
@@ -579,25 +547,7 @@
           <w:szCs w:val="36"/>
           <w:lang w:val="en-IN"/>
         </w:rPr>
-        <w:t xml:space="preserve">Got to know about the smoothening and bandwidth value of </w:t>
-      </w:r>
-      <w:proofErr w:type="spellStart"/>
-      <w:r>
-        <w:rPr>
-          <w:sz w:val="36"/>
-          <w:szCs w:val="36"/>
-          <w:lang w:val="en-IN"/>
-        </w:rPr>
-        <w:t>kde</w:t>
-      </w:r>
-      <w:proofErr w:type="spellEnd"/>
-      <w:r>
-        <w:rPr>
-          <w:sz w:val="36"/>
-          <w:szCs w:val="36"/>
-          <w:lang w:val="en-IN"/>
-        </w:rPr>
-        <w:t xml:space="preserve"> plot which</w:t>
+        <w:t>Got to know about the smoothening and bandwidth value of kde plot which</w:t>
       </w:r>
       <w:r>
         <w:rPr>
@@ -829,6 +779,213 @@
         </w:rPr>
         <w:t>More people prefer paperless billing and electronic payment method.</w:t>
       </w:r>
+    </w:p>
+    <w:p>
+      <w:pPr>
+        <w:pStyle w:val="ListParagraph"/>
+        <w:numPr>
+          <w:ilvl w:val="0"/>
+          <w:numId w:val="26"/>
+        </w:numPr>
+        <w:rPr>
+          <w:sz w:val="36"/>
+          <w:szCs w:val="36"/>
+          <w:lang w:val="en-IN"/>
+        </w:rPr>
+      </w:pPr>
+      <w:r>
+        <w:rPr>
+          <w:sz w:val="36"/>
+          <w:szCs w:val="36"/>
+          <w:lang w:val="en-IN"/>
+        </w:rPr>
+        <w:t>Multivariate Analysis:</w:t>
+      </w:r>
+    </w:p>
+    <w:p>
+      <w:pPr>
+        <w:pStyle w:val="ListParagraph"/>
+        <w:numPr>
+          <w:ilvl w:val="0"/>
+          <w:numId w:val="28"/>
+        </w:numPr>
+        <w:rPr>
+          <w:sz w:val="36"/>
+          <w:szCs w:val="36"/>
+          <w:lang w:val="en-IN"/>
+        </w:rPr>
+      </w:pPr>
+      <w:r>
+        <w:rPr>
+          <w:sz w:val="36"/>
+          <w:szCs w:val="36"/>
+          <w:lang w:val="en-IN"/>
+        </w:rPr>
+        <w:t>Churn numbers are less in this data.</w:t>
+      </w:r>
+    </w:p>
+    <w:p>
+      <w:pPr>
+        <w:pStyle w:val="ListParagraph"/>
+        <w:numPr>
+          <w:ilvl w:val="0"/>
+          <w:numId w:val="28"/>
+        </w:numPr>
+        <w:rPr>
+          <w:sz w:val="36"/>
+          <w:szCs w:val="36"/>
+          <w:lang w:val="en-IN"/>
+        </w:rPr>
+      </w:pPr>
+      <w:r>
+        <w:rPr>
+          <w:sz w:val="36"/>
+          <w:szCs w:val="36"/>
+          <w:lang w:val="en-IN"/>
+        </w:rPr>
+        <w:lastRenderedPageBreak/>
+        <w:t xml:space="preserve">People are more likely to churn, if </w:t>
+      </w:r>
+      <w:r>
+        <w:rPr>
+          <w:sz w:val="36"/>
+          <w:szCs w:val="36"/>
+          <w:lang w:val="en-IN"/>
+        </w:rPr>
+        <w:t>their</w:t>
+      </w:r>
+      <w:r>
+        <w:rPr>
+          <w:sz w:val="36"/>
+          <w:szCs w:val="36"/>
+          <w:lang w:val="en-IN"/>
+        </w:rPr>
+        <w:t xml:space="preserve"> contract is per month.</w:t>
+      </w:r>
+    </w:p>
+    <w:p>
+      <w:pPr>
+        <w:pStyle w:val="ListParagraph"/>
+        <w:numPr>
+          <w:ilvl w:val="0"/>
+          <w:numId w:val="28"/>
+        </w:numPr>
+        <w:rPr>
+          <w:sz w:val="36"/>
+          <w:szCs w:val="36"/>
+          <w:lang w:val="en-IN"/>
+        </w:rPr>
+      </w:pPr>
+      <w:r>
+        <w:rPr>
+          <w:sz w:val="36"/>
+          <w:szCs w:val="36"/>
+          <w:lang w:val="en-IN"/>
+        </w:rPr>
+        <w:t>Gender has no or negligible effect on the churn</w:t>
+      </w:r>
+    </w:p>
+    <w:p>
+      <w:pPr>
+        <w:pStyle w:val="ListParagraph"/>
+        <w:numPr>
+          <w:ilvl w:val="0"/>
+          <w:numId w:val="28"/>
+        </w:numPr>
+        <w:rPr>
+          <w:sz w:val="36"/>
+          <w:szCs w:val="36"/>
+          <w:lang w:val="en-IN"/>
+        </w:rPr>
+      </w:pPr>
+      <w:r>
+        <w:rPr>
+          <w:sz w:val="36"/>
+          <w:szCs w:val="36"/>
+          <w:lang w:val="en-IN"/>
+        </w:rPr>
+        <w:t>Senior Citizen are the ones who churn more generally, but senior citizen on a contract for a month has very high chances to churn.</w:t>
+      </w:r>
+    </w:p>
+    <w:p>
+      <w:pPr>
+        <w:pStyle w:val="ListParagraph"/>
+        <w:numPr>
+          <w:ilvl w:val="0"/>
+          <w:numId w:val="28"/>
+        </w:numPr>
+        <w:rPr>
+          <w:sz w:val="36"/>
+          <w:szCs w:val="36"/>
+          <w:lang w:val="en-IN"/>
+        </w:rPr>
+      </w:pPr>
+      <w:r>
+        <w:rPr>
+          <w:sz w:val="36"/>
+          <w:szCs w:val="36"/>
+          <w:lang w:val="en-IN"/>
+        </w:rPr>
+        <w:t>More services reduce churn</w:t>
+      </w:r>
+    </w:p>
+    <w:p>
+      <w:pPr>
+        <w:pStyle w:val="ListParagraph"/>
+        <w:numPr>
+          <w:ilvl w:val="0"/>
+          <w:numId w:val="28"/>
+        </w:numPr>
+        <w:rPr>
+          <w:sz w:val="36"/>
+          <w:szCs w:val="36"/>
+          <w:lang w:val="en-IN"/>
+        </w:rPr>
+      </w:pPr>
+      <w:r>
+        <w:rPr>
+          <w:sz w:val="36"/>
+          <w:szCs w:val="36"/>
+          <w:lang w:val="en-IN"/>
+        </w:rPr>
+        <w:t xml:space="preserve">Customer with partner tends to stay for a long tenure than a bachelor person. </w:t>
+      </w:r>
+      <w:r>
+        <w:rPr>
+          <w:sz w:val="36"/>
+          <w:szCs w:val="36"/>
+          <w:lang w:val="en-IN"/>
+        </w:rPr>
+        <w:t>And they also churn less.</w:t>
+      </w:r>
+    </w:p>
+    <w:p>
+      <w:pPr>
+        <w:pStyle w:val="ListParagraph"/>
+        <w:numPr>
+          <w:ilvl w:val="0"/>
+          <w:numId w:val="28"/>
+        </w:numPr>
+        <w:rPr>
+          <w:sz w:val="36"/>
+          <w:szCs w:val="36"/>
+          <w:lang w:val="en-IN"/>
+        </w:rPr>
+      </w:pPr>
+    </w:p>
+    <w:p>
+      <w:pPr>
+        <w:pStyle w:val="ListParagraph"/>
+        <w:numPr>
+          <w:ilvl w:val="0"/>
+          <w:numId w:val="26"/>
+        </w:numPr>
+        <w:rPr>
+          <w:sz w:val="36"/>
+          <w:szCs w:val="36"/>
+          <w:lang w:val="en-IN"/>
+        </w:rPr>
+      </w:pPr>
     </w:p>
     <w:p>
       <w:pPr>
@@ -2410,6 +2567,119 @@
     </w:lvl>
   </w:abstractNum>
   <w:abstractNum w:abstractNumId="25" w15:restartNumberingAfterBreak="0">
+    <w:nsid w:val="623C5A5F"/>
+    <w:multiLevelType w:val="hybridMultilevel"/>
+    <w:tmpl w:val="53FC498C"/>
+    <w:lvl w:ilvl="0" w:tplc="40090001">
+      <w:start w:val="1"/>
+      <w:numFmt w:val="bullet"/>
+      <w:lvlText w:val=""/>
+      <w:lvlJc w:val="left"/>
+      <w:pPr>
+        <w:ind w:left="1440" w:hanging="360"/>
+      </w:pPr>
+      <w:rPr>
+        <w:rFonts w:ascii="Symbol" w:hAnsi="Symbol" w:hint="default"/>
+      </w:rPr>
+    </w:lvl>
+    <w:lvl w:ilvl="1" w:tplc="40090003" w:tentative="1">
+      <w:start w:val="1"/>
+      <w:numFmt w:val="bullet"/>
+      <w:lvlText w:val="o"/>
+      <w:lvlJc w:val="left"/>
+      <w:pPr>
+        <w:ind w:left="2160" w:hanging="360"/>
+      </w:pPr>
+      <w:rPr>
+        <w:rFonts w:ascii="Courier New" w:hAnsi="Courier New" w:cs="Courier New" w:hint="default"/>
+      </w:rPr>
+    </w:lvl>
+    <w:lvl w:ilvl="2" w:tplc="40090005" w:tentative="1">
+      <w:start w:val="1"/>
+      <w:numFmt w:val="bullet"/>
+      <w:lvlText w:val=""/>
+      <w:lvlJc w:val="left"/>
+      <w:pPr>
+        <w:ind w:left="2880" w:hanging="360"/>
+      </w:pPr>
+      <w:rPr>
+        <w:rFonts w:ascii="Wingdings" w:hAnsi="Wingdings" w:hint="default"/>
+      </w:rPr>
+    </w:lvl>
+    <w:lvl w:ilvl="3" w:tplc="40090001" w:tentative="1">
+      <w:start w:val="1"/>
+      <w:numFmt w:val="bullet"/>
+      <w:lvlText w:val=""/>
+      <w:lvlJc w:val="left"/>
+      <w:pPr>
+        <w:ind w:left="3600" w:hanging="360"/>
+      </w:pPr>
+      <w:rPr>
+        <w:rFonts w:ascii="Symbol" w:hAnsi="Symbol" w:hint="default"/>
+      </w:rPr>
+    </w:lvl>
+    <w:lvl w:ilvl="4" w:tplc="40090003" w:tentative="1">
+      <w:start w:val="1"/>
+      <w:numFmt w:val="bullet"/>
+      <w:lvlText w:val="o"/>
+      <w:lvlJc w:val="left"/>
+      <w:pPr>
+        <w:ind w:left="4320" w:hanging="360"/>
+      </w:pPr>
+      <w:rPr>
+        <w:rFonts w:ascii="Courier New" w:hAnsi="Courier New" w:cs="Courier New" w:hint="default"/>
+      </w:rPr>
+    </w:lvl>
+    <w:lvl w:ilvl="5" w:tplc="40090005" w:tentative="1">
+      <w:start w:val="1"/>
+      <w:numFmt w:val="bullet"/>
+      <w:lvlText w:val=""/>
+      <w:lvlJc w:val="left"/>
+      <w:pPr>
+        <w:ind w:left="5040" w:hanging="360"/>
+      </w:pPr>
+      <w:rPr>
+        <w:rFonts w:ascii="Wingdings" w:hAnsi="Wingdings" w:hint="default"/>
+      </w:rPr>
+    </w:lvl>
+    <w:lvl w:ilvl="6" w:tplc="40090001" w:tentative="1">
+      <w:start w:val="1"/>
+      <w:numFmt w:val="bullet"/>
+      <w:lvlText w:val=""/>
+      <w:lvlJc w:val="left"/>
+      <w:pPr>
+        <w:ind w:left="5760" w:hanging="360"/>
+      </w:pPr>
+      <w:rPr>
+        <w:rFonts w:ascii="Symbol" w:hAnsi="Symbol" w:hint="default"/>
+      </w:rPr>
+    </w:lvl>
+    <w:lvl w:ilvl="7" w:tplc="40090003" w:tentative="1">
+      <w:start w:val="1"/>
+      <w:numFmt w:val="bullet"/>
+      <w:lvlText w:val="o"/>
+      <w:lvlJc w:val="left"/>
+      <w:pPr>
+        <w:ind w:left="6480" w:hanging="360"/>
+      </w:pPr>
+      <w:rPr>
+        <w:rFonts w:ascii="Courier New" w:hAnsi="Courier New" w:cs="Courier New" w:hint="default"/>
+      </w:rPr>
+    </w:lvl>
+    <w:lvl w:ilvl="8" w:tplc="40090005" w:tentative="1">
+      <w:start w:val="1"/>
+      <w:numFmt w:val="bullet"/>
+      <w:lvlText w:val=""/>
+      <w:lvlJc w:val="left"/>
+      <w:pPr>
+        <w:ind w:left="7200" w:hanging="360"/>
+      </w:pPr>
+      <w:rPr>
+        <w:rFonts w:ascii="Wingdings" w:hAnsi="Wingdings" w:hint="default"/>
+      </w:rPr>
+    </w:lvl>
+  </w:abstractNum>
+  <w:abstractNum w:abstractNumId="26" w15:restartNumberingAfterBreak="0">
     <w:nsid w:val="6E9514D7"/>
     <w:multiLevelType w:val="multilevel"/>
     <w:tmpl w:val="0409001F"/>
@@ -2495,7 +2765,7 @@
       </w:pPr>
     </w:lvl>
   </w:abstractNum>
-  <w:abstractNum w:abstractNumId="26" w15:restartNumberingAfterBreak="0">
+  <w:abstractNum w:abstractNumId="27" w15:restartNumberingAfterBreak="0">
     <w:nsid w:val="7D8C2C6D"/>
     <w:multiLevelType w:val="multilevel"/>
     <w:tmpl w:val="04090023"/>
@@ -2592,7 +2862,7 @@
     <w:abstractNumId w:val="10"/>
   </w:num>
   <w:num w:numId="4" w16cid:durableId="1890916904">
-    <w:abstractNumId w:val="25"/>
+    <w:abstractNumId w:val="26"/>
   </w:num>
   <w:num w:numId="5" w16cid:durableId="489563050">
     <w:abstractNumId w:val="14"/>
@@ -2649,7 +2919,7 @@
     <w:abstractNumId w:val="12"/>
   </w:num>
   <w:num w:numId="23" w16cid:durableId="1493446580">
-    <w:abstractNumId w:val="26"/>
+    <w:abstractNumId w:val="27"/>
   </w:num>
   <w:num w:numId="24" w16cid:durableId="1172916259">
     <w:abstractNumId w:val="17"/>
@@ -2662,6 +2932,9 @@
   </w:num>
   <w:num w:numId="27" w16cid:durableId="993532354">
     <w:abstractNumId w:val="23"/>
+  </w:num>
+  <w:num w:numId="28" w16cid:durableId="1662614565">
+    <w:abstractNumId w:val="25"/>
   </w:num>
 </w:numbering>
 </file>

</xml_diff>

<commit_message>
Added some decisions,which I will take later
</commit_message>
<xml_diff>
--- a/docs/Project_Documentation.docx
+++ b/docs/Project_Documentation.docx
@@ -964,7 +964,7 @@
         <w:pStyle w:val="ListParagraph"/>
         <w:numPr>
           <w:ilvl w:val="0"/>
-          <w:numId w:val="28"/>
+          <w:numId w:val="26"/>
         </w:numPr>
         <w:rPr>
           <w:sz w:val="36"/>
@@ -972,13 +972,81 @@
           <w:lang w:val="en-IN"/>
         </w:rPr>
       </w:pPr>
+      <w:r>
+        <w:rPr>
+          <w:sz w:val="36"/>
+          <w:szCs w:val="36"/>
+          <w:lang w:val="en-IN"/>
+        </w:rPr>
+        <w:t>Future Decisions to take after EDA</w:t>
+      </w:r>
+      <w:r>
+        <w:rPr>
+          <w:sz w:val="36"/>
+          <w:szCs w:val="36"/>
+          <w:lang w:val="en-IN"/>
+        </w:rPr>
+        <w:t>:</w:t>
+      </w:r>
     </w:p>
     <w:p>
       <w:pPr>
         <w:pStyle w:val="ListParagraph"/>
         <w:numPr>
           <w:ilvl w:val="0"/>
-          <w:numId w:val="26"/>
+          <w:numId w:val="29"/>
+        </w:numPr>
+        <w:rPr>
+          <w:sz w:val="36"/>
+          <w:szCs w:val="36"/>
+          <w:lang w:val="en-IN"/>
+        </w:rPr>
+      </w:pPr>
+      <w:r>
+        <w:rPr>
+          <w:sz w:val="36"/>
+          <w:szCs w:val="36"/>
+          <w:lang w:val="en-IN"/>
+        </w:rPr>
+        <w:t>Drop Customer ID</w:t>
+      </w:r>
+      <w:r>
+        <w:rPr>
+          <w:sz w:val="36"/>
+          <w:szCs w:val="36"/>
+          <w:lang w:val="en-IN"/>
+        </w:rPr>
+        <w:t xml:space="preserve"> as its useless and drop total charges, as it will not be contributing much to the model, because it is a derived feature. Made from tenure and monthly charges.</w:t>
+      </w:r>
+    </w:p>
+    <w:p>
+      <w:pPr>
+        <w:pStyle w:val="ListParagraph"/>
+        <w:numPr>
+          <w:ilvl w:val="0"/>
+          <w:numId w:val="29"/>
+        </w:numPr>
+        <w:rPr>
+          <w:sz w:val="36"/>
+          <w:szCs w:val="36"/>
+          <w:lang w:val="en-IN"/>
+        </w:rPr>
+      </w:pPr>
+      <w:r>
+        <w:rPr>
+          <w:sz w:val="36"/>
+          <w:szCs w:val="36"/>
+          <w:lang w:val="en-IN"/>
+        </w:rPr>
+        <w:t>Data type of each feature needs to be changed</w:t>
+      </w:r>
+    </w:p>
+    <w:p>
+      <w:pPr>
+        <w:pStyle w:val="ListParagraph"/>
+        <w:numPr>
+          <w:ilvl w:val="0"/>
+          <w:numId w:val="29"/>
         </w:numPr>
         <w:rPr>
           <w:sz w:val="36"/>
@@ -1290,7 +1358,7 @@
         <w:ind w:left="720" w:hanging="360"/>
       </w:pPr>
     </w:lvl>
-    <w:lvl w:ilvl="1" w:tplc="40090019" w:tentative="1">
+    <w:lvl w:ilvl="1" w:tplc="40090019">
       <w:start w:val="1"/>
       <w:numFmt w:val="lowerLetter"/>
       <w:lvlText w:val="%2."/>
@@ -2020,6 +2088,119 @@
     </w:lvl>
   </w:abstractNum>
   <w:abstractNum w:abstractNumId="19" w15:restartNumberingAfterBreak="0">
+    <w:nsid w:val="31AA7D3B"/>
+    <w:multiLevelType w:val="hybridMultilevel"/>
+    <w:tmpl w:val="3D4E50EE"/>
+    <w:lvl w:ilvl="0" w:tplc="40090001">
+      <w:start w:val="1"/>
+      <w:numFmt w:val="bullet"/>
+      <w:lvlText w:val=""/>
+      <w:lvlJc w:val="left"/>
+      <w:pPr>
+        <w:ind w:left="1440" w:hanging="360"/>
+      </w:pPr>
+      <w:rPr>
+        <w:rFonts w:ascii="Symbol" w:hAnsi="Symbol" w:hint="default"/>
+      </w:rPr>
+    </w:lvl>
+    <w:lvl w:ilvl="1" w:tplc="40090003" w:tentative="1">
+      <w:start w:val="1"/>
+      <w:numFmt w:val="bullet"/>
+      <w:lvlText w:val="o"/>
+      <w:lvlJc w:val="left"/>
+      <w:pPr>
+        <w:ind w:left="2160" w:hanging="360"/>
+      </w:pPr>
+      <w:rPr>
+        <w:rFonts w:ascii="Courier New" w:hAnsi="Courier New" w:cs="Courier New" w:hint="default"/>
+      </w:rPr>
+    </w:lvl>
+    <w:lvl w:ilvl="2" w:tplc="40090005" w:tentative="1">
+      <w:start w:val="1"/>
+      <w:numFmt w:val="bullet"/>
+      <w:lvlText w:val=""/>
+      <w:lvlJc w:val="left"/>
+      <w:pPr>
+        <w:ind w:left="2880" w:hanging="360"/>
+      </w:pPr>
+      <w:rPr>
+        <w:rFonts w:ascii="Wingdings" w:hAnsi="Wingdings" w:hint="default"/>
+      </w:rPr>
+    </w:lvl>
+    <w:lvl w:ilvl="3" w:tplc="40090001" w:tentative="1">
+      <w:start w:val="1"/>
+      <w:numFmt w:val="bullet"/>
+      <w:lvlText w:val=""/>
+      <w:lvlJc w:val="left"/>
+      <w:pPr>
+        <w:ind w:left="3600" w:hanging="360"/>
+      </w:pPr>
+      <w:rPr>
+        <w:rFonts w:ascii="Symbol" w:hAnsi="Symbol" w:hint="default"/>
+      </w:rPr>
+    </w:lvl>
+    <w:lvl w:ilvl="4" w:tplc="40090003" w:tentative="1">
+      <w:start w:val="1"/>
+      <w:numFmt w:val="bullet"/>
+      <w:lvlText w:val="o"/>
+      <w:lvlJc w:val="left"/>
+      <w:pPr>
+        <w:ind w:left="4320" w:hanging="360"/>
+      </w:pPr>
+      <w:rPr>
+        <w:rFonts w:ascii="Courier New" w:hAnsi="Courier New" w:cs="Courier New" w:hint="default"/>
+      </w:rPr>
+    </w:lvl>
+    <w:lvl w:ilvl="5" w:tplc="40090005" w:tentative="1">
+      <w:start w:val="1"/>
+      <w:numFmt w:val="bullet"/>
+      <w:lvlText w:val=""/>
+      <w:lvlJc w:val="left"/>
+      <w:pPr>
+        <w:ind w:left="5040" w:hanging="360"/>
+      </w:pPr>
+      <w:rPr>
+        <w:rFonts w:ascii="Wingdings" w:hAnsi="Wingdings" w:hint="default"/>
+      </w:rPr>
+    </w:lvl>
+    <w:lvl w:ilvl="6" w:tplc="40090001" w:tentative="1">
+      <w:start w:val="1"/>
+      <w:numFmt w:val="bullet"/>
+      <w:lvlText w:val=""/>
+      <w:lvlJc w:val="left"/>
+      <w:pPr>
+        <w:ind w:left="5760" w:hanging="360"/>
+      </w:pPr>
+      <w:rPr>
+        <w:rFonts w:ascii="Symbol" w:hAnsi="Symbol" w:hint="default"/>
+      </w:rPr>
+    </w:lvl>
+    <w:lvl w:ilvl="7" w:tplc="40090003" w:tentative="1">
+      <w:start w:val="1"/>
+      <w:numFmt w:val="bullet"/>
+      <w:lvlText w:val="o"/>
+      <w:lvlJc w:val="left"/>
+      <w:pPr>
+        <w:ind w:left="6480" w:hanging="360"/>
+      </w:pPr>
+      <w:rPr>
+        <w:rFonts w:ascii="Courier New" w:hAnsi="Courier New" w:cs="Courier New" w:hint="default"/>
+      </w:rPr>
+    </w:lvl>
+    <w:lvl w:ilvl="8" w:tplc="40090005" w:tentative="1">
+      <w:start w:val="1"/>
+      <w:numFmt w:val="bullet"/>
+      <w:lvlText w:val=""/>
+      <w:lvlJc w:val="left"/>
+      <w:pPr>
+        <w:ind w:left="7200" w:hanging="360"/>
+      </w:pPr>
+      <w:rPr>
+        <w:rFonts w:ascii="Wingdings" w:hAnsi="Wingdings" w:hint="default"/>
+      </w:rPr>
+    </w:lvl>
+  </w:abstractNum>
+  <w:abstractNum w:abstractNumId="20" w15:restartNumberingAfterBreak="0">
     <w:nsid w:val="3AEB0273"/>
     <w:multiLevelType w:val="multilevel"/>
     <w:tmpl w:val="526206A0"/>
@@ -2106,7 +2287,7 @@
       </w:pPr>
     </w:lvl>
   </w:abstractNum>
-  <w:abstractNum w:abstractNumId="20" w15:restartNumberingAfterBreak="0">
+  <w:abstractNum w:abstractNumId="21" w15:restartNumberingAfterBreak="0">
     <w:nsid w:val="43F8503E"/>
     <w:multiLevelType w:val="multilevel"/>
     <w:tmpl w:val="0409001F"/>
@@ -2192,7 +2373,7 @@
       </w:pPr>
     </w:lvl>
   </w:abstractNum>
-  <w:abstractNum w:abstractNumId="21" w15:restartNumberingAfterBreak="0">
+  <w:abstractNum w:abstractNumId="22" w15:restartNumberingAfterBreak="0">
     <w:nsid w:val="484C4F29"/>
     <w:multiLevelType w:val="multilevel"/>
     <w:tmpl w:val="D8061F64"/>
@@ -2279,7 +2460,7 @@
       </w:pPr>
     </w:lvl>
   </w:abstractNum>
-  <w:abstractNum w:abstractNumId="22" w15:restartNumberingAfterBreak="0">
+  <w:abstractNum w:abstractNumId="23" w15:restartNumberingAfterBreak="0">
     <w:nsid w:val="59350CFB"/>
     <w:multiLevelType w:val="multilevel"/>
     <w:tmpl w:val="9DF09F08"/>
@@ -2366,7 +2547,7 @@
       </w:pPr>
     </w:lvl>
   </w:abstractNum>
-  <w:abstractNum w:abstractNumId="23" w15:restartNumberingAfterBreak="0">
+  <w:abstractNum w:abstractNumId="24" w15:restartNumberingAfterBreak="0">
     <w:nsid w:val="5A570C11"/>
     <w:multiLevelType w:val="hybridMultilevel"/>
     <w:tmpl w:val="433E049C"/>
@@ -2479,7 +2660,7 @@
       </w:rPr>
     </w:lvl>
   </w:abstractNum>
-  <w:abstractNum w:abstractNumId="24" w15:restartNumberingAfterBreak="0">
+  <w:abstractNum w:abstractNumId="25" w15:restartNumberingAfterBreak="0">
     <w:nsid w:val="5DEC6B47"/>
     <w:multiLevelType w:val="multilevel"/>
     <w:tmpl w:val="604E1C0A"/>
@@ -2566,7 +2747,7 @@
       </w:pPr>
     </w:lvl>
   </w:abstractNum>
-  <w:abstractNum w:abstractNumId="25" w15:restartNumberingAfterBreak="0">
+  <w:abstractNum w:abstractNumId="26" w15:restartNumberingAfterBreak="0">
     <w:nsid w:val="623C5A5F"/>
     <w:multiLevelType w:val="hybridMultilevel"/>
     <w:tmpl w:val="53FC498C"/>
@@ -2679,7 +2860,7 @@
       </w:rPr>
     </w:lvl>
   </w:abstractNum>
-  <w:abstractNum w:abstractNumId="26" w15:restartNumberingAfterBreak="0">
+  <w:abstractNum w:abstractNumId="27" w15:restartNumberingAfterBreak="0">
     <w:nsid w:val="6E9514D7"/>
     <w:multiLevelType w:val="multilevel"/>
     <w:tmpl w:val="0409001F"/>
@@ -2765,7 +2946,7 @@
       </w:pPr>
     </w:lvl>
   </w:abstractNum>
-  <w:abstractNum w:abstractNumId="27" w15:restartNumberingAfterBreak="0">
+  <w:abstractNum w:abstractNumId="28" w15:restartNumberingAfterBreak="0">
     <w:nsid w:val="7D8C2C6D"/>
     <w:multiLevelType w:val="multilevel"/>
     <w:tmpl w:val="04090023"/>
@@ -2853,7 +3034,7 @@
     </w:lvl>
   </w:abstractNum>
   <w:num w:numId="1" w16cid:durableId="1512137068">
-    <w:abstractNumId w:val="22"/>
+    <w:abstractNumId w:val="23"/>
   </w:num>
   <w:num w:numId="2" w16cid:durableId="377901402">
     <w:abstractNumId w:val="13"/>
@@ -2862,16 +3043,16 @@
     <w:abstractNumId w:val="10"/>
   </w:num>
   <w:num w:numId="4" w16cid:durableId="1890916904">
-    <w:abstractNumId w:val="26"/>
+    <w:abstractNumId w:val="27"/>
   </w:num>
   <w:num w:numId="5" w16cid:durableId="489563050">
     <w:abstractNumId w:val="14"/>
   </w:num>
   <w:num w:numId="6" w16cid:durableId="507063207">
-    <w:abstractNumId w:val="19"/>
+    <w:abstractNumId w:val="20"/>
   </w:num>
   <w:num w:numId="7" w16cid:durableId="1520311144">
-    <w:abstractNumId w:val="21"/>
+    <w:abstractNumId w:val="22"/>
   </w:num>
   <w:num w:numId="8" w16cid:durableId="1657951427">
     <w:abstractNumId w:val="9"/>
@@ -2910,16 +3091,16 @@
     <w:abstractNumId w:val="18"/>
   </w:num>
   <w:num w:numId="20" w16cid:durableId="1712073880">
-    <w:abstractNumId w:val="24"/>
+    <w:abstractNumId w:val="25"/>
   </w:num>
   <w:num w:numId="21" w16cid:durableId="1635452601">
-    <w:abstractNumId w:val="20"/>
+    <w:abstractNumId w:val="21"/>
   </w:num>
   <w:num w:numId="22" w16cid:durableId="45880512">
     <w:abstractNumId w:val="12"/>
   </w:num>
   <w:num w:numId="23" w16cid:durableId="1493446580">
-    <w:abstractNumId w:val="27"/>
+    <w:abstractNumId w:val="28"/>
   </w:num>
   <w:num w:numId="24" w16cid:durableId="1172916259">
     <w:abstractNumId w:val="17"/>
@@ -2931,10 +3112,13 @@
     <w:abstractNumId w:val="11"/>
   </w:num>
   <w:num w:numId="27" w16cid:durableId="993532354">
-    <w:abstractNumId w:val="23"/>
+    <w:abstractNumId w:val="24"/>
   </w:num>
   <w:num w:numId="28" w16cid:durableId="1662614565">
-    <w:abstractNumId w:val="25"/>
+    <w:abstractNumId w:val="26"/>
+  </w:num>
+  <w:num w:numId="29" w16cid:durableId="1352876667">
+    <w:abstractNumId w:val="19"/>
   </w:num>
 </w:numbering>
 </file>

</xml_diff>

<commit_message>
Updated the documentation with LR and DTC outcomes
</commit_message>
<xml_diff>
--- a/docs/Project_Documentation.docx
+++ b/docs/Project_Documentation.docx
@@ -1043,21 +1043,273 @@
     </w:p>
     <w:p>
       <w:pPr>
+        <w:rPr>
+          <w:sz w:val="36"/>
+          <w:szCs w:val="36"/>
+          <w:lang w:val="en-IN"/>
+        </w:rPr>
+      </w:pPr>
+    </w:p>
+    <w:p>
+      <w:pPr>
+        <w:rPr>
+          <w:sz w:val="36"/>
+          <w:szCs w:val="36"/>
+          <w:lang w:val="en-IN"/>
+        </w:rPr>
+      </w:pPr>
+    </w:p>
+    <w:p>
+      <w:pPr>
+        <w:rPr>
+          <w:sz w:val="36"/>
+          <w:szCs w:val="36"/>
+          <w:lang w:val="en-IN"/>
+        </w:rPr>
+      </w:pPr>
+    </w:p>
+    <w:p>
+      <w:pPr>
+        <w:rPr>
+          <w:sz w:val="36"/>
+          <w:szCs w:val="36"/>
+          <w:lang w:val="en-IN"/>
+        </w:rPr>
+      </w:pPr>
+    </w:p>
+    <w:p>
+      <w:pPr>
+        <w:rPr>
+          <w:sz w:val="36"/>
+          <w:szCs w:val="36"/>
+          <w:lang w:val="en-IN"/>
+        </w:rPr>
+      </w:pPr>
+    </w:p>
+    <w:p>
+      <w:pPr>
+        <w:rPr>
+          <w:sz w:val="36"/>
+          <w:szCs w:val="36"/>
+          <w:lang w:val="en-IN"/>
+        </w:rPr>
+      </w:pPr>
+    </w:p>
+    <w:p>
+      <w:pPr>
+        <w:rPr>
+          <w:sz w:val="36"/>
+          <w:szCs w:val="36"/>
+          <w:lang w:val="en-IN"/>
+        </w:rPr>
+      </w:pPr>
+    </w:p>
+    <w:p>
+      <w:pPr>
+        <w:rPr>
+          <w:sz w:val="36"/>
+          <w:szCs w:val="36"/>
+          <w:lang w:val="en-IN"/>
+        </w:rPr>
+      </w:pPr>
+    </w:p>
+    <w:p>
+      <w:pPr>
+        <w:rPr>
+          <w:sz w:val="36"/>
+          <w:szCs w:val="36"/>
+          <w:lang w:val="en-IN"/>
+        </w:rPr>
+      </w:pPr>
+    </w:p>
+    <w:p>
+      <w:pPr>
+        <w:rPr>
+          <w:sz w:val="36"/>
+          <w:szCs w:val="36"/>
+          <w:lang w:val="en-IN"/>
+        </w:rPr>
+      </w:pPr>
+    </w:p>
+    <w:p>
+      <w:pPr>
+        <w:rPr>
+          <w:sz w:val="36"/>
+          <w:szCs w:val="36"/>
+          <w:lang w:val="en-IN"/>
+        </w:rPr>
+      </w:pPr>
+    </w:p>
+    <w:p>
+      <w:pPr>
+        <w:rPr>
+          <w:sz w:val="36"/>
+          <w:szCs w:val="36"/>
+          <w:lang w:val="en-IN"/>
+        </w:rPr>
+      </w:pPr>
+    </w:p>
+    <w:p>
+      <w:pPr>
+        <w:rPr>
+          <w:sz w:val="36"/>
+          <w:szCs w:val="36"/>
+          <w:lang w:val="en-IN"/>
+        </w:rPr>
+      </w:pPr>
+    </w:p>
+    <w:p>
+      <w:pPr>
+        <w:rPr>
+          <w:sz w:val="36"/>
+          <w:szCs w:val="36"/>
+          <w:lang w:val="en-IN"/>
+        </w:rPr>
+      </w:pPr>
+    </w:p>
+    <w:p>
+      <w:pPr>
+        <w:jc w:val="center"/>
+        <w:rPr>
+          <w:sz w:val="72"/>
+          <w:szCs w:val="72"/>
+          <w:u w:val="single"/>
+          <w:lang w:val="en-IN"/>
+        </w:rPr>
+      </w:pPr>
+      <w:r>
+        <w:rPr>
+          <w:sz w:val="72"/>
+          <w:szCs w:val="72"/>
+          <w:u w:val="single"/>
+          <w:lang w:val="en-IN"/>
+        </w:rPr>
+        <w:lastRenderedPageBreak/>
+        <w:t xml:space="preserve">Model Training and </w:t>
+      </w:r>
+      <w:proofErr w:type="gramStart"/>
+      <w:r>
+        <w:rPr>
+          <w:sz w:val="72"/>
+          <w:szCs w:val="72"/>
+          <w:u w:val="single"/>
+          <w:lang w:val="en-IN"/>
+        </w:rPr>
+        <w:t>it’s</w:t>
+      </w:r>
+      <w:proofErr w:type="gramEnd"/>
+      <w:r>
+        <w:rPr>
+          <w:sz w:val="72"/>
+          <w:szCs w:val="72"/>
+          <w:u w:val="single"/>
+          <w:lang w:val="en-IN"/>
+        </w:rPr>
+        <w:t xml:space="preserve"> Outcome</w:t>
+      </w:r>
+    </w:p>
+    <w:p>
+      <w:pPr>
         <w:pStyle w:val="ListParagraph"/>
         <w:numPr>
           <w:ilvl w:val="0"/>
-          <w:numId w:val="29"/>
+          <w:numId w:val="30"/>
         </w:numPr>
         <w:rPr>
-          <w:sz w:val="36"/>
-          <w:szCs w:val="36"/>
-          <w:lang w:val="en-IN"/>
-        </w:rPr>
-      </w:pPr>
-    </w:p>
-    <w:p>
-      <w:pPr>
-        <w:rPr>
+          <w:sz w:val="40"/>
+          <w:szCs w:val="40"/>
+          <w:lang w:val="en-IN"/>
+        </w:rPr>
+      </w:pPr>
+      <w:r>
+        <w:rPr>
+          <w:sz w:val="40"/>
+          <w:szCs w:val="40"/>
+          <w:lang w:val="en-IN"/>
+        </w:rPr>
+        <w:t>Prepared data, by scaling tenure and monthly charges. Encoding binary columns and contract is encoded with ordinal encoder, so that month-to-month can be distinguished by the model as it is the worst.</w:t>
+      </w:r>
+    </w:p>
+    <w:p>
+      <w:pPr>
+        <w:pStyle w:val="ListParagraph"/>
+        <w:numPr>
+          <w:ilvl w:val="0"/>
+          <w:numId w:val="30"/>
+        </w:numPr>
+        <w:rPr>
+          <w:sz w:val="40"/>
+          <w:szCs w:val="40"/>
+          <w:lang w:val="en-IN"/>
+        </w:rPr>
+      </w:pPr>
+      <w:r>
+        <w:rPr>
+          <w:sz w:val="40"/>
+          <w:szCs w:val="40"/>
+          <w:lang w:val="en-IN"/>
+        </w:rPr>
+        <w:t>After all the preprocessing, Logistic regression is trained, with a roc-</w:t>
+      </w:r>
+      <w:proofErr w:type="spellStart"/>
+      <w:r>
+        <w:rPr>
+          <w:sz w:val="40"/>
+          <w:szCs w:val="40"/>
+          <w:lang w:val="en-IN"/>
+        </w:rPr>
+        <w:t>auc</w:t>
+      </w:r>
+      <w:proofErr w:type="spellEnd"/>
+      <w:r>
+        <w:rPr>
+          <w:sz w:val="40"/>
+          <w:szCs w:val="40"/>
+          <w:lang w:val="en-IN"/>
+        </w:rPr>
+        <w:t xml:space="preserve"> score of 0.83, which is fine. But now I will move towards ensemble methods, which are more robust and will give better results.</w:t>
+      </w:r>
+    </w:p>
+    <w:p>
+      <w:pPr>
+        <w:pStyle w:val="ListParagraph"/>
+        <w:numPr>
+          <w:ilvl w:val="0"/>
+          <w:numId w:val="30"/>
+        </w:numPr>
+        <w:rPr>
+          <w:sz w:val="40"/>
+          <w:szCs w:val="40"/>
+          <w:lang w:val="en-IN"/>
+        </w:rPr>
+      </w:pPr>
+      <w:r>
+        <w:rPr>
+          <w:sz w:val="40"/>
+          <w:szCs w:val="40"/>
+          <w:lang w:val="en-IN"/>
+        </w:rPr>
+        <w:t>Model is GOOD at detecting chur</w:t>
+      </w:r>
+      <w:r>
+        <w:rPr>
+          <w:sz w:val="40"/>
+          <w:szCs w:val="40"/>
+          <w:lang w:val="en-IN"/>
+        </w:rPr>
+        <w:t>n, but it overpredicts churn</w:t>
+      </w:r>
+    </w:p>
+    <w:p>
+      <w:pPr>
+        <w:pStyle w:val="ListParagraph"/>
+        <w:numPr>
+          <w:ilvl w:val="0"/>
+          <w:numId w:val="30"/>
+        </w:numPr>
+        <w:rPr>
+          <w:sz w:val="40"/>
+          <w:szCs w:val="40"/>
           <w:lang w:val="en-IN"/>
         </w:rPr>
       </w:pPr>
@@ -1348,7 +1600,7 @@
   <w:abstractNum w:abstractNumId="11" w15:restartNumberingAfterBreak="0">
     <w:nsid w:val="043503E8"/>
     <w:multiLevelType w:val="hybridMultilevel"/>
-    <w:tmpl w:val="F6DAAA00"/>
+    <w:tmpl w:val="B16CEA26"/>
     <w:lvl w:ilvl="0" w:tplc="4009000F">
       <w:start w:val="1"/>
       <w:numFmt w:val="decimal"/>
@@ -2661,6 +2913,119 @@
     </w:lvl>
   </w:abstractNum>
   <w:abstractNum w:abstractNumId="25" w15:restartNumberingAfterBreak="0">
+    <w:nsid w:val="5AA12AAA"/>
+    <w:multiLevelType w:val="hybridMultilevel"/>
+    <w:tmpl w:val="D21C1568"/>
+    <w:lvl w:ilvl="0" w:tplc="40090001">
+      <w:start w:val="1"/>
+      <w:numFmt w:val="bullet"/>
+      <w:lvlText w:val=""/>
+      <w:lvlJc w:val="left"/>
+      <w:pPr>
+        <w:ind w:left="1080" w:hanging="360"/>
+      </w:pPr>
+      <w:rPr>
+        <w:rFonts w:ascii="Symbol" w:hAnsi="Symbol" w:hint="default"/>
+      </w:rPr>
+    </w:lvl>
+    <w:lvl w:ilvl="1" w:tplc="40090003" w:tentative="1">
+      <w:start w:val="1"/>
+      <w:numFmt w:val="bullet"/>
+      <w:lvlText w:val="o"/>
+      <w:lvlJc w:val="left"/>
+      <w:pPr>
+        <w:ind w:left="1800" w:hanging="360"/>
+      </w:pPr>
+      <w:rPr>
+        <w:rFonts w:ascii="Courier New" w:hAnsi="Courier New" w:cs="Courier New" w:hint="default"/>
+      </w:rPr>
+    </w:lvl>
+    <w:lvl w:ilvl="2" w:tplc="40090005" w:tentative="1">
+      <w:start w:val="1"/>
+      <w:numFmt w:val="bullet"/>
+      <w:lvlText w:val=""/>
+      <w:lvlJc w:val="left"/>
+      <w:pPr>
+        <w:ind w:left="2520" w:hanging="360"/>
+      </w:pPr>
+      <w:rPr>
+        <w:rFonts w:ascii="Wingdings" w:hAnsi="Wingdings" w:hint="default"/>
+      </w:rPr>
+    </w:lvl>
+    <w:lvl w:ilvl="3" w:tplc="40090001" w:tentative="1">
+      <w:start w:val="1"/>
+      <w:numFmt w:val="bullet"/>
+      <w:lvlText w:val=""/>
+      <w:lvlJc w:val="left"/>
+      <w:pPr>
+        <w:ind w:left="3240" w:hanging="360"/>
+      </w:pPr>
+      <w:rPr>
+        <w:rFonts w:ascii="Symbol" w:hAnsi="Symbol" w:hint="default"/>
+      </w:rPr>
+    </w:lvl>
+    <w:lvl w:ilvl="4" w:tplc="40090003" w:tentative="1">
+      <w:start w:val="1"/>
+      <w:numFmt w:val="bullet"/>
+      <w:lvlText w:val="o"/>
+      <w:lvlJc w:val="left"/>
+      <w:pPr>
+        <w:ind w:left="3960" w:hanging="360"/>
+      </w:pPr>
+      <w:rPr>
+        <w:rFonts w:ascii="Courier New" w:hAnsi="Courier New" w:cs="Courier New" w:hint="default"/>
+      </w:rPr>
+    </w:lvl>
+    <w:lvl w:ilvl="5" w:tplc="40090005" w:tentative="1">
+      <w:start w:val="1"/>
+      <w:numFmt w:val="bullet"/>
+      <w:lvlText w:val=""/>
+      <w:lvlJc w:val="left"/>
+      <w:pPr>
+        <w:ind w:left="4680" w:hanging="360"/>
+      </w:pPr>
+      <w:rPr>
+        <w:rFonts w:ascii="Wingdings" w:hAnsi="Wingdings" w:hint="default"/>
+      </w:rPr>
+    </w:lvl>
+    <w:lvl w:ilvl="6" w:tplc="40090001" w:tentative="1">
+      <w:start w:val="1"/>
+      <w:numFmt w:val="bullet"/>
+      <w:lvlText w:val=""/>
+      <w:lvlJc w:val="left"/>
+      <w:pPr>
+        <w:ind w:left="5400" w:hanging="360"/>
+      </w:pPr>
+      <w:rPr>
+        <w:rFonts w:ascii="Symbol" w:hAnsi="Symbol" w:hint="default"/>
+      </w:rPr>
+    </w:lvl>
+    <w:lvl w:ilvl="7" w:tplc="40090003" w:tentative="1">
+      <w:start w:val="1"/>
+      <w:numFmt w:val="bullet"/>
+      <w:lvlText w:val="o"/>
+      <w:lvlJc w:val="left"/>
+      <w:pPr>
+        <w:ind w:left="6120" w:hanging="360"/>
+      </w:pPr>
+      <w:rPr>
+        <w:rFonts w:ascii="Courier New" w:hAnsi="Courier New" w:cs="Courier New" w:hint="default"/>
+      </w:rPr>
+    </w:lvl>
+    <w:lvl w:ilvl="8" w:tplc="40090005" w:tentative="1">
+      <w:start w:val="1"/>
+      <w:numFmt w:val="bullet"/>
+      <w:lvlText w:val=""/>
+      <w:lvlJc w:val="left"/>
+      <w:pPr>
+        <w:ind w:left="6840" w:hanging="360"/>
+      </w:pPr>
+      <w:rPr>
+        <w:rFonts w:ascii="Wingdings" w:hAnsi="Wingdings" w:hint="default"/>
+      </w:rPr>
+    </w:lvl>
+  </w:abstractNum>
+  <w:abstractNum w:abstractNumId="26" w15:restartNumberingAfterBreak="0">
     <w:nsid w:val="5DEC6B47"/>
     <w:multiLevelType w:val="multilevel"/>
     <w:tmpl w:val="604E1C0A"/>
@@ -2747,7 +3112,7 @@
       </w:pPr>
     </w:lvl>
   </w:abstractNum>
-  <w:abstractNum w:abstractNumId="26" w15:restartNumberingAfterBreak="0">
+  <w:abstractNum w:abstractNumId="27" w15:restartNumberingAfterBreak="0">
     <w:nsid w:val="623C5A5F"/>
     <w:multiLevelType w:val="hybridMultilevel"/>
     <w:tmpl w:val="53FC498C"/>
@@ -2860,7 +3225,7 @@
       </w:rPr>
     </w:lvl>
   </w:abstractNum>
-  <w:abstractNum w:abstractNumId="27" w15:restartNumberingAfterBreak="0">
+  <w:abstractNum w:abstractNumId="28" w15:restartNumberingAfterBreak="0">
     <w:nsid w:val="6E9514D7"/>
     <w:multiLevelType w:val="multilevel"/>
     <w:tmpl w:val="0409001F"/>
@@ -2946,7 +3311,7 @@
       </w:pPr>
     </w:lvl>
   </w:abstractNum>
-  <w:abstractNum w:abstractNumId="28" w15:restartNumberingAfterBreak="0">
+  <w:abstractNum w:abstractNumId="29" w15:restartNumberingAfterBreak="0">
     <w:nsid w:val="7D8C2C6D"/>
     <w:multiLevelType w:val="multilevel"/>
     <w:tmpl w:val="04090023"/>
@@ -3043,7 +3408,7 @@
     <w:abstractNumId w:val="10"/>
   </w:num>
   <w:num w:numId="4" w16cid:durableId="1890916904">
-    <w:abstractNumId w:val="27"/>
+    <w:abstractNumId w:val="28"/>
   </w:num>
   <w:num w:numId="5" w16cid:durableId="489563050">
     <w:abstractNumId w:val="14"/>
@@ -3091,7 +3456,7 @@
     <w:abstractNumId w:val="18"/>
   </w:num>
   <w:num w:numId="20" w16cid:durableId="1712073880">
-    <w:abstractNumId w:val="25"/>
+    <w:abstractNumId w:val="26"/>
   </w:num>
   <w:num w:numId="21" w16cid:durableId="1635452601">
     <w:abstractNumId w:val="21"/>
@@ -3100,7 +3465,7 @@
     <w:abstractNumId w:val="12"/>
   </w:num>
   <w:num w:numId="23" w16cid:durableId="1493446580">
-    <w:abstractNumId w:val="28"/>
+    <w:abstractNumId w:val="29"/>
   </w:num>
   <w:num w:numId="24" w16cid:durableId="1172916259">
     <w:abstractNumId w:val="17"/>
@@ -3115,10 +3480,13 @@
     <w:abstractNumId w:val="24"/>
   </w:num>
   <w:num w:numId="28" w16cid:durableId="1662614565">
-    <w:abstractNumId w:val="26"/>
+    <w:abstractNumId w:val="27"/>
   </w:num>
   <w:num w:numId="29" w16cid:durableId="1352876667">
     <w:abstractNumId w:val="19"/>
+  </w:num>
+  <w:num w:numId="30" w16cid:durableId="774137000">
+    <w:abstractNumId w:val="25"/>
   </w:num>
 </w:numbering>
 </file>
@@ -4800,12 +5168,139 @@
 </file>
 
 <file path=customXml/item1.xml><?xml version="1.0" encoding="utf-8"?>
-<?mso-contentType ?>
-<FormTemplates xmlns="http://schemas.microsoft.com/sharepoint/v3/contenttype/forms">
-  <Display>DocumentLibraryForm</Display>
-  <Edit>AssetEditForm</Edit>
-  <New>DocumentLibraryForm</New>
-</FormTemplates>
+<p:properties xmlns:p="http://schemas.microsoft.com/office/2006/metadata/properties" xmlns:xsi="http://www.w3.org/2001/XMLSchema-instance" xmlns:pc="http://schemas.microsoft.com/office/infopath/2007/PartnerControls">
+  <documentManagement>
+    <LocLastLocAttemptVersionTypeLookup xmlns="4873beb7-5857-4685-be1f-d57550cc96cc" xsi:nil="true"/>
+    <MarketSpecific xmlns="4873beb7-5857-4685-be1f-d57550cc96cc">false</MarketSpecific>
+    <ApprovalStatus xmlns="4873beb7-5857-4685-be1f-d57550cc96cc">InProgress</ApprovalStatus>
+    <LocComments xmlns="4873beb7-5857-4685-be1f-d57550cc96cc" xsi:nil="true"/>
+    <DirectSourceMarket xmlns="4873beb7-5857-4685-be1f-d57550cc96cc" xsi:nil="true"/>
+    <LocPublishedLinkedAssetsLookup xmlns="4873beb7-5857-4685-be1f-d57550cc96cc" xsi:nil="true"/>
+    <ThumbnailAssetId xmlns="4873beb7-5857-4685-be1f-d57550cc96cc" xsi:nil="true"/>
+    <PrimaryImageGen xmlns="4873beb7-5857-4685-be1f-d57550cc96cc">true</PrimaryImageGen>
+    <LegacyData xmlns="4873beb7-5857-4685-be1f-d57550cc96cc" xsi:nil="true"/>
+    <LocNewPublishedVersionLookup xmlns="4873beb7-5857-4685-be1f-d57550cc96cc" xsi:nil="true"/>
+    <NumericId xmlns="4873beb7-5857-4685-be1f-d57550cc96cc">102787001</NumericId>
+    <TPFriendlyName xmlns="4873beb7-5857-4685-be1f-d57550cc96cc" xsi:nil="true"/>
+    <LocOverallPublishStatusLookup xmlns="4873beb7-5857-4685-be1f-d57550cc96cc" xsi:nil="true"/>
+    <LocRecommendedHandoff xmlns="4873beb7-5857-4685-be1f-d57550cc96cc" xsi:nil="true"/>
+    <BlockPublish xmlns="4873beb7-5857-4685-be1f-d57550cc96cc">false</BlockPublish>
+    <BusinessGroup xmlns="4873beb7-5857-4685-be1f-d57550cc96cc" xsi:nil="true"/>
+    <OpenTemplate xmlns="4873beb7-5857-4685-be1f-d57550cc96cc">true</OpenTemplate>
+    <SourceTitle xmlns="4873beb7-5857-4685-be1f-d57550cc96cc" xsi:nil="true"/>
+    <LocOverallLocStatusLookup xmlns="4873beb7-5857-4685-be1f-d57550cc96cc" xsi:nil="true"/>
+    <APEditor xmlns="4873beb7-5857-4685-be1f-d57550cc96cc">
+      <UserInfo>
+        <DisplayName/>
+        <AccountId xsi:nil="true"/>
+        <AccountType/>
+      </UserInfo>
+    </APEditor>
+    <UALocComments xmlns="4873beb7-5857-4685-be1f-d57550cc96cc" xsi:nil="true"/>
+    <IntlLangReviewDate xmlns="4873beb7-5857-4685-be1f-d57550cc96cc" xsi:nil="true"/>
+    <PublishStatusLookup xmlns="4873beb7-5857-4685-be1f-d57550cc96cc">
+      <Value>1343188</Value>
+    </PublishStatusLookup>
+    <ParentAssetId xmlns="4873beb7-5857-4685-be1f-d57550cc96cc" xsi:nil="true"/>
+    <FeatureTagsTaxHTField0 xmlns="4873beb7-5857-4685-be1f-d57550cc96cc">
+      <Terms xmlns="http://schemas.microsoft.com/office/infopath/2007/PartnerControls"/>
+    </FeatureTagsTaxHTField0>
+    <MachineTranslated xmlns="4873beb7-5857-4685-be1f-d57550cc96cc">false</MachineTranslated>
+    <Providers xmlns="4873beb7-5857-4685-be1f-d57550cc96cc" xsi:nil="true"/>
+    <OriginalSourceMarket xmlns="4873beb7-5857-4685-be1f-d57550cc96cc" xsi:nil="true"/>
+    <APDescription xmlns="4873beb7-5857-4685-be1f-d57550cc96cc" xsi:nil="true"/>
+    <ContentItem xmlns="4873beb7-5857-4685-be1f-d57550cc96cc" xsi:nil="true"/>
+    <ClipArtFilename xmlns="4873beb7-5857-4685-be1f-d57550cc96cc" xsi:nil="true"/>
+    <TPInstallLocation xmlns="4873beb7-5857-4685-be1f-d57550cc96cc" xsi:nil="true"/>
+    <TimesCloned xmlns="4873beb7-5857-4685-be1f-d57550cc96cc" xsi:nil="true"/>
+    <PublishTargets xmlns="4873beb7-5857-4685-be1f-d57550cc96cc">OfficeOnlineVNext</PublishTargets>
+    <AcquiredFrom xmlns="4873beb7-5857-4685-be1f-d57550cc96cc">Internal MS</AcquiredFrom>
+    <AssetStart xmlns="4873beb7-5857-4685-be1f-d57550cc96cc">2011-11-23T17:29:00+00:00</AssetStart>
+    <FriendlyTitle xmlns="4873beb7-5857-4685-be1f-d57550cc96cc" xsi:nil="true"/>
+    <Provider xmlns="4873beb7-5857-4685-be1f-d57550cc96cc" xsi:nil="true"/>
+    <LastHandOff xmlns="4873beb7-5857-4685-be1f-d57550cc96cc" xsi:nil="true"/>
+    <TPClientViewer xmlns="4873beb7-5857-4685-be1f-d57550cc96cc" xsi:nil="true"/>
+    <TemplateStatus xmlns="4873beb7-5857-4685-be1f-d57550cc96cc">Complete</TemplateStatus>
+    <Downloads xmlns="4873beb7-5857-4685-be1f-d57550cc96cc">0</Downloads>
+    <OOCacheId xmlns="4873beb7-5857-4685-be1f-d57550cc96cc" xsi:nil="true"/>
+    <IsDeleted xmlns="4873beb7-5857-4685-be1f-d57550cc96cc">false</IsDeleted>
+    <LocPublishedDependentAssetsLookup xmlns="4873beb7-5857-4685-be1f-d57550cc96cc" xsi:nil="true"/>
+    <AssetExpire xmlns="4873beb7-5857-4685-be1f-d57550cc96cc">2029-05-12T07:00:00+00:00</AssetExpire>
+    <CSXSubmissionMarket xmlns="4873beb7-5857-4685-be1f-d57550cc96cc" xsi:nil="true"/>
+    <DSATActionTaken xmlns="4873beb7-5857-4685-be1f-d57550cc96cc" xsi:nil="true"/>
+    <SubmitterId xmlns="4873beb7-5857-4685-be1f-d57550cc96cc" xsi:nil="true"/>
+    <EditorialTags xmlns="4873beb7-5857-4685-be1f-d57550cc96cc" xsi:nil="true"/>
+    <TPExecutable xmlns="4873beb7-5857-4685-be1f-d57550cc96cc" xsi:nil="true"/>
+    <CSXSubmissionDate xmlns="4873beb7-5857-4685-be1f-d57550cc96cc" xsi:nil="true"/>
+    <CSXUpdate xmlns="4873beb7-5857-4685-be1f-d57550cc96cc">false</CSXUpdate>
+    <AssetType xmlns="4873beb7-5857-4685-be1f-d57550cc96cc">TP</AssetType>
+    <ApprovalLog xmlns="4873beb7-5857-4685-be1f-d57550cc96cc" xsi:nil="true"/>
+    <BugNumber xmlns="4873beb7-5857-4685-be1f-d57550cc96cc" xsi:nil="true"/>
+    <OriginAsset xmlns="4873beb7-5857-4685-be1f-d57550cc96cc" xsi:nil="true"/>
+    <TPComponent xmlns="4873beb7-5857-4685-be1f-d57550cc96cc" xsi:nil="true"/>
+    <Milestone xmlns="4873beb7-5857-4685-be1f-d57550cc96cc" xsi:nil="true"/>
+    <RecommendationsModifier xmlns="4873beb7-5857-4685-be1f-d57550cc96cc" xsi:nil="true"/>
+    <AssetId xmlns="4873beb7-5857-4685-be1f-d57550cc96cc">TP102787001</AssetId>
+    <PolicheckWords xmlns="4873beb7-5857-4685-be1f-d57550cc96cc" xsi:nil="true"/>
+    <TPLaunchHelpLink xmlns="4873beb7-5857-4685-be1f-d57550cc96cc" xsi:nil="true"/>
+    <IntlLocPriority xmlns="4873beb7-5857-4685-be1f-d57550cc96cc" xsi:nil="true"/>
+    <TPApplication xmlns="4873beb7-5857-4685-be1f-d57550cc96cc" xsi:nil="true"/>
+    <IntlLangReviewer xmlns="4873beb7-5857-4685-be1f-d57550cc96cc" xsi:nil="true"/>
+    <HandoffToMSDN xmlns="4873beb7-5857-4685-be1f-d57550cc96cc" xsi:nil="true"/>
+    <PlannedPubDate xmlns="4873beb7-5857-4685-be1f-d57550cc96cc" xsi:nil="true"/>
+    <CrawlForDependencies xmlns="4873beb7-5857-4685-be1f-d57550cc96cc">false</CrawlForDependencies>
+    <LocLastLocAttemptVersionLookup xmlns="4873beb7-5857-4685-be1f-d57550cc96cc">693888</LocLastLocAttemptVersionLookup>
+    <LocProcessedForHandoffsLookup xmlns="4873beb7-5857-4685-be1f-d57550cc96cc" xsi:nil="true"/>
+    <TrustLevel xmlns="4873beb7-5857-4685-be1f-d57550cc96cc">1 Microsoft Managed Content</TrustLevel>
+    <CampaignTagsTaxHTField0 xmlns="4873beb7-5857-4685-be1f-d57550cc96cc">
+      <Terms xmlns="http://schemas.microsoft.com/office/infopath/2007/PartnerControls"/>
+    </CampaignTagsTaxHTField0>
+    <TPNamespace xmlns="4873beb7-5857-4685-be1f-d57550cc96cc" xsi:nil="true"/>
+    <LocOverallPreviewStatusLookup xmlns="4873beb7-5857-4685-be1f-d57550cc96cc" xsi:nil="true"/>
+    <TaxCatchAll xmlns="4873beb7-5857-4685-be1f-d57550cc96cc"/>
+    <IsSearchable xmlns="4873beb7-5857-4685-be1f-d57550cc96cc">false</IsSearchable>
+    <TemplateTemplateType xmlns="4873beb7-5857-4685-be1f-d57550cc96cc">Word Document Template</TemplateTemplateType>
+    <Markets xmlns="4873beb7-5857-4685-be1f-d57550cc96cc"/>
+    <IntlLangReview xmlns="4873beb7-5857-4685-be1f-d57550cc96cc" xsi:nil="true"/>
+    <UAProjectedTotalWords xmlns="4873beb7-5857-4685-be1f-d57550cc96cc" xsi:nil="true"/>
+    <OutputCachingOn xmlns="4873beb7-5857-4685-be1f-d57550cc96cc">false</OutputCachingOn>
+    <AverageRating xmlns="4873beb7-5857-4685-be1f-d57550cc96cc" xsi:nil="true"/>
+    <LocMarketGroupTiers2 xmlns="4873beb7-5857-4685-be1f-d57550cc96cc" xsi:nil="true"/>
+    <APAuthor xmlns="4873beb7-5857-4685-be1f-d57550cc96cc">
+      <UserInfo>
+        <DisplayName>REDMOND\v-namall</DisplayName>
+        <AccountId>978</AccountId>
+        <AccountType/>
+      </UserInfo>
+    </APAuthor>
+    <TPCommandLine xmlns="4873beb7-5857-4685-be1f-d57550cc96cc" xsi:nil="true"/>
+    <LocManualTestRequired xmlns="4873beb7-5857-4685-be1f-d57550cc96cc">false</LocManualTestRequired>
+    <TPAppVersion xmlns="4873beb7-5857-4685-be1f-d57550cc96cc" xsi:nil="true"/>
+    <EditorialStatus xmlns="4873beb7-5857-4685-be1f-d57550cc96cc">Complete</EditorialStatus>
+    <LocProcessedForMarketsLookup xmlns="4873beb7-5857-4685-be1f-d57550cc96cc" xsi:nil="true"/>
+    <LastModifiedDateTime xmlns="4873beb7-5857-4685-be1f-d57550cc96cc" xsi:nil="true"/>
+    <TPLaunchHelpLinkType xmlns="4873beb7-5857-4685-be1f-d57550cc96cc">Template</TPLaunchHelpLinkType>
+    <ScenarioTagsTaxHTField0 xmlns="4873beb7-5857-4685-be1f-d57550cc96cc">
+      <Terms xmlns="http://schemas.microsoft.com/office/infopath/2007/PartnerControls"/>
+    </ScenarioTagsTaxHTField0>
+    <OriginalRelease xmlns="4873beb7-5857-4685-be1f-d57550cc96cc">14</OriginalRelease>
+    <LocalizationTagsTaxHTField0 xmlns="4873beb7-5857-4685-be1f-d57550cc96cc">
+      <Terms xmlns="http://schemas.microsoft.com/office/infopath/2007/PartnerControls"/>
+    </LocalizationTagsTaxHTField0>
+    <Manager xmlns="4873beb7-5857-4685-be1f-d57550cc96cc" xsi:nil="true"/>
+    <UALocRecommendation xmlns="4873beb7-5857-4685-be1f-d57550cc96cc">Localize</UALocRecommendation>
+    <LocOverallHandbackStatusLookup xmlns="4873beb7-5857-4685-be1f-d57550cc96cc" xsi:nil="true"/>
+    <ArtSampleDocs xmlns="4873beb7-5857-4685-be1f-d57550cc96cc" xsi:nil="true"/>
+    <UACurrentWords xmlns="4873beb7-5857-4685-be1f-d57550cc96cc" xsi:nil="true"/>
+    <ShowIn xmlns="4873beb7-5857-4685-be1f-d57550cc96cc">Show everywhere</ShowIn>
+    <CSXHash xmlns="4873beb7-5857-4685-be1f-d57550cc96cc" xsi:nil="true"/>
+    <VoteCount xmlns="4873beb7-5857-4685-be1f-d57550cc96cc" xsi:nil="true"/>
+    <InternalTagsTaxHTField0 xmlns="4873beb7-5857-4685-be1f-d57550cc96cc">
+      <Terms xmlns="http://schemas.microsoft.com/office/infopath/2007/PartnerControls"/>
+    </InternalTagsTaxHTField0>
+    <UANotes xmlns="4873beb7-5857-4685-be1f-d57550cc96cc" xsi:nil="true"/>
+  </documentManagement>
+</p:properties>
 </file>
 
 <file path=customXml/item2.xml><?xml version="1.0" encoding="utf-8"?>
@@ -5849,145 +6344,20 @@
 </file>
 
 <file path=customXml/item3.xml><?xml version="1.0" encoding="utf-8"?>
-<p:properties xmlns:p="http://schemas.microsoft.com/office/2006/metadata/properties" xmlns:xsi="http://www.w3.org/2001/XMLSchema-instance" xmlns:pc="http://schemas.microsoft.com/office/infopath/2007/PartnerControls">
-  <documentManagement>
-    <LocLastLocAttemptVersionTypeLookup xmlns="4873beb7-5857-4685-be1f-d57550cc96cc" xsi:nil="true"/>
-    <MarketSpecific xmlns="4873beb7-5857-4685-be1f-d57550cc96cc">false</MarketSpecific>
-    <ApprovalStatus xmlns="4873beb7-5857-4685-be1f-d57550cc96cc">InProgress</ApprovalStatus>
-    <LocComments xmlns="4873beb7-5857-4685-be1f-d57550cc96cc" xsi:nil="true"/>
-    <DirectSourceMarket xmlns="4873beb7-5857-4685-be1f-d57550cc96cc" xsi:nil="true"/>
-    <LocPublishedLinkedAssetsLookup xmlns="4873beb7-5857-4685-be1f-d57550cc96cc" xsi:nil="true"/>
-    <ThumbnailAssetId xmlns="4873beb7-5857-4685-be1f-d57550cc96cc" xsi:nil="true"/>
-    <PrimaryImageGen xmlns="4873beb7-5857-4685-be1f-d57550cc96cc">true</PrimaryImageGen>
-    <LegacyData xmlns="4873beb7-5857-4685-be1f-d57550cc96cc" xsi:nil="true"/>
-    <LocNewPublishedVersionLookup xmlns="4873beb7-5857-4685-be1f-d57550cc96cc" xsi:nil="true"/>
-    <NumericId xmlns="4873beb7-5857-4685-be1f-d57550cc96cc">102787001</NumericId>
-    <TPFriendlyName xmlns="4873beb7-5857-4685-be1f-d57550cc96cc" xsi:nil="true"/>
-    <LocOverallPublishStatusLookup xmlns="4873beb7-5857-4685-be1f-d57550cc96cc" xsi:nil="true"/>
-    <LocRecommendedHandoff xmlns="4873beb7-5857-4685-be1f-d57550cc96cc" xsi:nil="true"/>
-    <BlockPublish xmlns="4873beb7-5857-4685-be1f-d57550cc96cc">false</BlockPublish>
-    <BusinessGroup xmlns="4873beb7-5857-4685-be1f-d57550cc96cc" xsi:nil="true"/>
-    <OpenTemplate xmlns="4873beb7-5857-4685-be1f-d57550cc96cc">true</OpenTemplate>
-    <SourceTitle xmlns="4873beb7-5857-4685-be1f-d57550cc96cc" xsi:nil="true"/>
-    <LocOverallLocStatusLookup xmlns="4873beb7-5857-4685-be1f-d57550cc96cc" xsi:nil="true"/>
-    <APEditor xmlns="4873beb7-5857-4685-be1f-d57550cc96cc">
-      <UserInfo>
-        <DisplayName/>
-        <AccountId xsi:nil="true"/>
-        <AccountType/>
-      </UserInfo>
-    </APEditor>
-    <UALocComments xmlns="4873beb7-5857-4685-be1f-d57550cc96cc" xsi:nil="true"/>
-    <IntlLangReviewDate xmlns="4873beb7-5857-4685-be1f-d57550cc96cc" xsi:nil="true"/>
-    <PublishStatusLookup xmlns="4873beb7-5857-4685-be1f-d57550cc96cc">
-      <Value>1343188</Value>
-    </PublishStatusLookup>
-    <ParentAssetId xmlns="4873beb7-5857-4685-be1f-d57550cc96cc" xsi:nil="true"/>
-    <FeatureTagsTaxHTField0 xmlns="4873beb7-5857-4685-be1f-d57550cc96cc">
-      <Terms xmlns="http://schemas.microsoft.com/office/infopath/2007/PartnerControls"/>
-    </FeatureTagsTaxHTField0>
-    <MachineTranslated xmlns="4873beb7-5857-4685-be1f-d57550cc96cc">false</MachineTranslated>
-    <Providers xmlns="4873beb7-5857-4685-be1f-d57550cc96cc" xsi:nil="true"/>
-    <OriginalSourceMarket xmlns="4873beb7-5857-4685-be1f-d57550cc96cc" xsi:nil="true"/>
-    <APDescription xmlns="4873beb7-5857-4685-be1f-d57550cc96cc" xsi:nil="true"/>
-    <ContentItem xmlns="4873beb7-5857-4685-be1f-d57550cc96cc" xsi:nil="true"/>
-    <ClipArtFilename xmlns="4873beb7-5857-4685-be1f-d57550cc96cc" xsi:nil="true"/>
-    <TPInstallLocation xmlns="4873beb7-5857-4685-be1f-d57550cc96cc" xsi:nil="true"/>
-    <TimesCloned xmlns="4873beb7-5857-4685-be1f-d57550cc96cc" xsi:nil="true"/>
-    <PublishTargets xmlns="4873beb7-5857-4685-be1f-d57550cc96cc">OfficeOnlineVNext</PublishTargets>
-    <AcquiredFrom xmlns="4873beb7-5857-4685-be1f-d57550cc96cc">Internal MS</AcquiredFrom>
-    <AssetStart xmlns="4873beb7-5857-4685-be1f-d57550cc96cc">2011-11-23T17:29:00+00:00</AssetStart>
-    <FriendlyTitle xmlns="4873beb7-5857-4685-be1f-d57550cc96cc" xsi:nil="true"/>
-    <Provider xmlns="4873beb7-5857-4685-be1f-d57550cc96cc" xsi:nil="true"/>
-    <LastHandOff xmlns="4873beb7-5857-4685-be1f-d57550cc96cc" xsi:nil="true"/>
-    <TPClientViewer xmlns="4873beb7-5857-4685-be1f-d57550cc96cc" xsi:nil="true"/>
-    <TemplateStatus xmlns="4873beb7-5857-4685-be1f-d57550cc96cc">Complete</TemplateStatus>
-    <Downloads xmlns="4873beb7-5857-4685-be1f-d57550cc96cc">0</Downloads>
-    <OOCacheId xmlns="4873beb7-5857-4685-be1f-d57550cc96cc" xsi:nil="true"/>
-    <IsDeleted xmlns="4873beb7-5857-4685-be1f-d57550cc96cc">false</IsDeleted>
-    <LocPublishedDependentAssetsLookup xmlns="4873beb7-5857-4685-be1f-d57550cc96cc" xsi:nil="true"/>
-    <AssetExpire xmlns="4873beb7-5857-4685-be1f-d57550cc96cc">2029-05-12T07:00:00+00:00</AssetExpire>
-    <CSXSubmissionMarket xmlns="4873beb7-5857-4685-be1f-d57550cc96cc" xsi:nil="true"/>
-    <DSATActionTaken xmlns="4873beb7-5857-4685-be1f-d57550cc96cc" xsi:nil="true"/>
-    <SubmitterId xmlns="4873beb7-5857-4685-be1f-d57550cc96cc" xsi:nil="true"/>
-    <EditorialTags xmlns="4873beb7-5857-4685-be1f-d57550cc96cc" xsi:nil="true"/>
-    <TPExecutable xmlns="4873beb7-5857-4685-be1f-d57550cc96cc" xsi:nil="true"/>
-    <CSXSubmissionDate xmlns="4873beb7-5857-4685-be1f-d57550cc96cc" xsi:nil="true"/>
-    <CSXUpdate xmlns="4873beb7-5857-4685-be1f-d57550cc96cc">false</CSXUpdate>
-    <AssetType xmlns="4873beb7-5857-4685-be1f-d57550cc96cc">TP</AssetType>
-    <ApprovalLog xmlns="4873beb7-5857-4685-be1f-d57550cc96cc" xsi:nil="true"/>
-    <BugNumber xmlns="4873beb7-5857-4685-be1f-d57550cc96cc" xsi:nil="true"/>
-    <OriginAsset xmlns="4873beb7-5857-4685-be1f-d57550cc96cc" xsi:nil="true"/>
-    <TPComponent xmlns="4873beb7-5857-4685-be1f-d57550cc96cc" xsi:nil="true"/>
-    <Milestone xmlns="4873beb7-5857-4685-be1f-d57550cc96cc" xsi:nil="true"/>
-    <RecommendationsModifier xmlns="4873beb7-5857-4685-be1f-d57550cc96cc" xsi:nil="true"/>
-    <AssetId xmlns="4873beb7-5857-4685-be1f-d57550cc96cc">TP102787001</AssetId>
-    <PolicheckWords xmlns="4873beb7-5857-4685-be1f-d57550cc96cc" xsi:nil="true"/>
-    <TPLaunchHelpLink xmlns="4873beb7-5857-4685-be1f-d57550cc96cc" xsi:nil="true"/>
-    <IntlLocPriority xmlns="4873beb7-5857-4685-be1f-d57550cc96cc" xsi:nil="true"/>
-    <TPApplication xmlns="4873beb7-5857-4685-be1f-d57550cc96cc" xsi:nil="true"/>
-    <IntlLangReviewer xmlns="4873beb7-5857-4685-be1f-d57550cc96cc" xsi:nil="true"/>
-    <HandoffToMSDN xmlns="4873beb7-5857-4685-be1f-d57550cc96cc" xsi:nil="true"/>
-    <PlannedPubDate xmlns="4873beb7-5857-4685-be1f-d57550cc96cc" xsi:nil="true"/>
-    <CrawlForDependencies xmlns="4873beb7-5857-4685-be1f-d57550cc96cc">false</CrawlForDependencies>
-    <LocLastLocAttemptVersionLookup xmlns="4873beb7-5857-4685-be1f-d57550cc96cc">693888</LocLastLocAttemptVersionLookup>
-    <LocProcessedForHandoffsLookup xmlns="4873beb7-5857-4685-be1f-d57550cc96cc" xsi:nil="true"/>
-    <TrustLevel xmlns="4873beb7-5857-4685-be1f-d57550cc96cc">1 Microsoft Managed Content</TrustLevel>
-    <CampaignTagsTaxHTField0 xmlns="4873beb7-5857-4685-be1f-d57550cc96cc">
-      <Terms xmlns="http://schemas.microsoft.com/office/infopath/2007/PartnerControls"/>
-    </CampaignTagsTaxHTField0>
-    <TPNamespace xmlns="4873beb7-5857-4685-be1f-d57550cc96cc" xsi:nil="true"/>
-    <LocOverallPreviewStatusLookup xmlns="4873beb7-5857-4685-be1f-d57550cc96cc" xsi:nil="true"/>
-    <TaxCatchAll xmlns="4873beb7-5857-4685-be1f-d57550cc96cc"/>
-    <IsSearchable xmlns="4873beb7-5857-4685-be1f-d57550cc96cc">false</IsSearchable>
-    <TemplateTemplateType xmlns="4873beb7-5857-4685-be1f-d57550cc96cc">Word Document Template</TemplateTemplateType>
-    <Markets xmlns="4873beb7-5857-4685-be1f-d57550cc96cc"/>
-    <IntlLangReview xmlns="4873beb7-5857-4685-be1f-d57550cc96cc" xsi:nil="true"/>
-    <UAProjectedTotalWords xmlns="4873beb7-5857-4685-be1f-d57550cc96cc" xsi:nil="true"/>
-    <OutputCachingOn xmlns="4873beb7-5857-4685-be1f-d57550cc96cc">false</OutputCachingOn>
-    <AverageRating xmlns="4873beb7-5857-4685-be1f-d57550cc96cc" xsi:nil="true"/>
-    <LocMarketGroupTiers2 xmlns="4873beb7-5857-4685-be1f-d57550cc96cc" xsi:nil="true"/>
-    <APAuthor xmlns="4873beb7-5857-4685-be1f-d57550cc96cc">
-      <UserInfo>
-        <DisplayName>REDMOND\v-namall</DisplayName>
-        <AccountId>978</AccountId>
-        <AccountType/>
-      </UserInfo>
-    </APAuthor>
-    <TPCommandLine xmlns="4873beb7-5857-4685-be1f-d57550cc96cc" xsi:nil="true"/>
-    <LocManualTestRequired xmlns="4873beb7-5857-4685-be1f-d57550cc96cc">false</LocManualTestRequired>
-    <TPAppVersion xmlns="4873beb7-5857-4685-be1f-d57550cc96cc" xsi:nil="true"/>
-    <EditorialStatus xmlns="4873beb7-5857-4685-be1f-d57550cc96cc">Complete</EditorialStatus>
-    <LocProcessedForMarketsLookup xmlns="4873beb7-5857-4685-be1f-d57550cc96cc" xsi:nil="true"/>
-    <LastModifiedDateTime xmlns="4873beb7-5857-4685-be1f-d57550cc96cc" xsi:nil="true"/>
-    <TPLaunchHelpLinkType xmlns="4873beb7-5857-4685-be1f-d57550cc96cc">Template</TPLaunchHelpLinkType>
-    <ScenarioTagsTaxHTField0 xmlns="4873beb7-5857-4685-be1f-d57550cc96cc">
-      <Terms xmlns="http://schemas.microsoft.com/office/infopath/2007/PartnerControls"/>
-    </ScenarioTagsTaxHTField0>
-    <OriginalRelease xmlns="4873beb7-5857-4685-be1f-d57550cc96cc">14</OriginalRelease>
-    <LocalizationTagsTaxHTField0 xmlns="4873beb7-5857-4685-be1f-d57550cc96cc">
-      <Terms xmlns="http://schemas.microsoft.com/office/infopath/2007/PartnerControls"/>
-    </LocalizationTagsTaxHTField0>
-    <Manager xmlns="4873beb7-5857-4685-be1f-d57550cc96cc" xsi:nil="true"/>
-    <UALocRecommendation xmlns="4873beb7-5857-4685-be1f-d57550cc96cc">Localize</UALocRecommendation>
-    <LocOverallHandbackStatusLookup xmlns="4873beb7-5857-4685-be1f-d57550cc96cc" xsi:nil="true"/>
-    <ArtSampleDocs xmlns="4873beb7-5857-4685-be1f-d57550cc96cc" xsi:nil="true"/>
-    <UACurrentWords xmlns="4873beb7-5857-4685-be1f-d57550cc96cc" xsi:nil="true"/>
-    <ShowIn xmlns="4873beb7-5857-4685-be1f-d57550cc96cc">Show everywhere</ShowIn>
-    <CSXHash xmlns="4873beb7-5857-4685-be1f-d57550cc96cc" xsi:nil="true"/>
-    <VoteCount xmlns="4873beb7-5857-4685-be1f-d57550cc96cc" xsi:nil="true"/>
-    <InternalTagsTaxHTField0 xmlns="4873beb7-5857-4685-be1f-d57550cc96cc">
-      <Terms xmlns="http://schemas.microsoft.com/office/infopath/2007/PartnerControls"/>
-    </InternalTagsTaxHTField0>
-    <UANotes xmlns="4873beb7-5857-4685-be1f-d57550cc96cc" xsi:nil="true"/>
-  </documentManagement>
-</p:properties>
+<?mso-contentType ?>
+<FormTemplates xmlns="http://schemas.microsoft.com/sharepoint/v3/contenttype/forms">
+  <Display>DocumentLibraryForm</Display>
+  <Edit>AssetEditForm</Edit>
+  <New>DocumentLibraryForm</New>
+</FormTemplates>
 </file>
 
 <file path=customXml/itemProps1.xml><?xml version="1.0" encoding="utf-8"?>
-<ds:datastoreItem xmlns:ds="http://schemas.openxmlformats.org/officeDocument/2006/customXml" ds:itemID="{C01C3C56-10DB-49F7-B061-44D8728D078A}">
+<ds:datastoreItem xmlns:ds="http://schemas.openxmlformats.org/officeDocument/2006/customXml" ds:itemID="{7FBDB1CC-CEFB-4E46-8174-1F0AA0D30B24}">
   <ds:schemaRefs>
-    <ds:schemaRef ds:uri="http://schemas.microsoft.com/sharepoint/v3/contenttype/forms"/>
+    <ds:schemaRef ds:uri="http://schemas.microsoft.com/office/2006/metadata/properties"/>
+    <ds:schemaRef ds:uri="http://schemas.microsoft.com/office/infopath/2007/PartnerControls"/>
+    <ds:schemaRef ds:uri="4873beb7-5857-4685-be1f-d57550cc96cc"/>
   </ds:schemaRefs>
 </ds:datastoreItem>
 </file>
@@ -6011,11 +6381,9 @@
 </file>
 
 <file path=customXml/itemProps3.xml><?xml version="1.0" encoding="utf-8"?>
-<ds:datastoreItem xmlns:ds="http://schemas.openxmlformats.org/officeDocument/2006/customXml" ds:itemID="{7FBDB1CC-CEFB-4E46-8174-1F0AA0D30B24}">
+<ds:datastoreItem xmlns:ds="http://schemas.openxmlformats.org/officeDocument/2006/customXml" ds:itemID="{C01C3C56-10DB-49F7-B061-44D8728D078A}">
   <ds:schemaRefs>
-    <ds:schemaRef ds:uri="http://schemas.microsoft.com/office/2006/metadata/properties"/>
-    <ds:schemaRef ds:uri="http://schemas.microsoft.com/office/infopath/2007/PartnerControls"/>
-    <ds:schemaRef ds:uri="4873beb7-5857-4685-be1f-d57550cc96cc"/>
+    <ds:schemaRef ds:uri="http://schemas.microsoft.com/sharepoint/v3/contenttype/forms"/>
   </ds:schemaRefs>
 </ds:datastoreItem>
 </file>
</xml_diff>

<commit_message>
Updated the documentation with what i have done till now and what will I do
</commit_message>
<xml_diff>
--- a/docs/Project_Documentation.docx
+++ b/docs/Project_Documentation.docx
@@ -1185,27 +1185,7 @@
           <w:lang w:val="en-IN"/>
         </w:rPr>
         <w:lastRenderedPageBreak/>
-        <w:t xml:space="preserve">Model Training and </w:t>
-      </w:r>
-      <w:proofErr w:type="gramStart"/>
-      <w:r>
-        <w:rPr>
-          <w:sz w:val="72"/>
-          <w:szCs w:val="72"/>
-          <w:u w:val="single"/>
-          <w:lang w:val="en-IN"/>
-        </w:rPr>
-        <w:t>it’s</w:t>
-      </w:r>
-      <w:proofErr w:type="gramEnd"/>
-      <w:r>
-        <w:rPr>
-          <w:sz w:val="72"/>
-          <w:szCs w:val="72"/>
-          <w:u w:val="single"/>
-          <w:lang w:val="en-IN"/>
-        </w:rPr>
-        <w:t xml:space="preserve"> Outcome</w:t>
+        <w:t>Model Training and it’s Outcome</w:t>
       </w:r>
     </w:p>
     <w:p>
@@ -1249,25 +1229,7 @@
           <w:szCs w:val="40"/>
           <w:lang w:val="en-IN"/>
         </w:rPr>
-        <w:t>After all the preprocessing, Logistic regression is trained, with a roc-</w:t>
-      </w:r>
-      <w:proofErr w:type="spellStart"/>
-      <w:r>
-        <w:rPr>
-          <w:sz w:val="40"/>
-          <w:szCs w:val="40"/>
-          <w:lang w:val="en-IN"/>
-        </w:rPr>
-        <w:t>auc</w:t>
-      </w:r>
-      <w:proofErr w:type="spellEnd"/>
-      <w:r>
-        <w:rPr>
-          <w:sz w:val="40"/>
-          <w:szCs w:val="40"/>
-          <w:lang w:val="en-IN"/>
-        </w:rPr>
-        <w:t xml:space="preserve"> score of 0.83, which is fine. But now I will move towards ensemble methods, which are more robust and will give better results.</w:t>
+        <w:t>After all the preprocessing, Logistic regression is trained, with a roc-auc score of 0.83, which is fine. But now I will move towards ensemble methods, which are more robust and will give better results.</w:t>
       </w:r>
     </w:p>
     <w:p>
@@ -1307,6 +1269,271 @@
           <w:ilvl w:val="0"/>
           <w:numId w:val="30"/>
         </w:numPr>
+        <w:rPr>
+          <w:sz w:val="40"/>
+          <w:szCs w:val="40"/>
+          <w:lang w:val="en-IN"/>
+        </w:rPr>
+      </w:pPr>
+      <w:r>
+        <w:rPr>
+          <w:sz w:val="40"/>
+          <w:szCs w:val="40"/>
+          <w:lang w:val="en-IN"/>
+        </w:rPr>
+        <w:t>Testing of many models is done, and the best model so far get is the XGBoost, which gives me the metrics:</w:t>
+      </w:r>
+      <w:r>
+        <w:rPr>
+          <w:sz w:val="40"/>
+          <w:szCs w:val="40"/>
+          <w:lang w:val="en-IN"/>
+        </w:rPr>
+        <w:br/>
+        <w:t xml:space="preserve">              </w:t>
+      </w:r>
+      <w:r>
+        <w:rPr>
+          <w:sz w:val="40"/>
+          <w:szCs w:val="40"/>
+          <w:lang w:val="en-IN"/>
+        </w:rPr>
+        <w:t xml:space="preserve">precision </w:t>
+      </w:r>
+      <w:r>
+        <w:rPr>
+          <w:sz w:val="40"/>
+          <w:szCs w:val="40"/>
+          <w:lang w:val="en-IN"/>
+        </w:rPr>
+        <w:t>|</w:t>
+      </w:r>
+      <w:r>
+        <w:rPr>
+          <w:sz w:val="40"/>
+          <w:szCs w:val="40"/>
+          <w:lang w:val="en-IN"/>
+        </w:rPr>
+        <w:t xml:space="preserve">   recall </w:t>
+      </w:r>
+      <w:r>
+        <w:rPr>
+          <w:sz w:val="40"/>
+          <w:szCs w:val="40"/>
+          <w:lang w:val="en-IN"/>
+        </w:rPr>
+        <w:t>|</w:t>
+      </w:r>
+      <w:r>
+        <w:rPr>
+          <w:sz w:val="40"/>
+          <w:szCs w:val="40"/>
+          <w:lang w:val="en-IN"/>
+        </w:rPr>
+        <w:t xml:space="preserve"> f1-score </w:t>
+      </w:r>
+      <w:r>
+        <w:rPr>
+          <w:sz w:val="40"/>
+          <w:szCs w:val="40"/>
+          <w:lang w:val="en-IN"/>
+        </w:rPr>
+        <w:t>|</w:t>
+      </w:r>
+      <w:r>
+        <w:rPr>
+          <w:sz w:val="40"/>
+          <w:szCs w:val="40"/>
+          <w:lang w:val="en-IN"/>
+        </w:rPr>
+        <w:t xml:space="preserve"> support</w:t>
+      </w:r>
+    </w:p>
+    <w:p>
+      <w:pPr>
+        <w:ind w:left="720"/>
+        <w:rPr>
+          <w:sz w:val="40"/>
+          <w:szCs w:val="40"/>
+          <w:lang w:val="en-IN"/>
+        </w:rPr>
+      </w:pPr>
+      <w:r>
+        <w:rPr>
+          <w:sz w:val="40"/>
+          <w:szCs w:val="40"/>
+          <w:lang w:val="en-IN"/>
+        </w:rPr>
+        <w:t xml:space="preserve">          0       0.88      </w:t>
+      </w:r>
+      <w:r>
+        <w:rPr>
+          <w:sz w:val="40"/>
+          <w:szCs w:val="40"/>
+          <w:lang w:val="en-IN"/>
+        </w:rPr>
+        <w:t xml:space="preserve">      </w:t>
+      </w:r>
+      <w:r>
+        <w:rPr>
+          <w:sz w:val="40"/>
+          <w:szCs w:val="40"/>
+          <w:lang w:val="en-IN"/>
+        </w:rPr>
+        <w:t xml:space="preserve">0.82      </w:t>
+      </w:r>
+      <w:r>
+        <w:rPr>
+          <w:sz w:val="40"/>
+          <w:szCs w:val="40"/>
+          <w:lang w:val="en-IN"/>
+        </w:rPr>
+        <w:t xml:space="preserve">    </w:t>
+      </w:r>
+      <w:r>
+        <w:rPr>
+          <w:sz w:val="40"/>
+          <w:szCs w:val="40"/>
+          <w:lang w:val="en-IN"/>
+        </w:rPr>
+        <w:t>0.85       763</w:t>
+      </w:r>
+    </w:p>
+    <w:p>
+      <w:pPr>
+        <w:ind w:left="720"/>
+        <w:rPr>
+          <w:sz w:val="40"/>
+          <w:szCs w:val="40"/>
+          <w:lang w:val="en-IN"/>
+        </w:rPr>
+      </w:pPr>
+      <w:r>
+        <w:rPr>
+          <w:sz w:val="40"/>
+          <w:szCs w:val="40"/>
+          <w:lang w:val="en-IN"/>
+        </w:rPr>
+        <w:t xml:space="preserve">   </w:t>
+      </w:r>
+      <w:r>
+        <w:rPr>
+          <w:sz w:val="40"/>
+          <w:szCs w:val="40"/>
+          <w:lang w:val="en-IN"/>
+        </w:rPr>
+        <w:t xml:space="preserve">       1       0.60      </w:t>
+      </w:r>
+      <w:r>
+        <w:rPr>
+          <w:sz w:val="40"/>
+          <w:szCs w:val="40"/>
+          <w:lang w:val="en-IN"/>
+        </w:rPr>
+        <w:t xml:space="preserve">      </w:t>
+      </w:r>
+      <w:r>
+        <w:rPr>
+          <w:sz w:val="40"/>
+          <w:szCs w:val="40"/>
+          <w:lang w:val="en-IN"/>
+        </w:rPr>
+        <w:t xml:space="preserve">0.70      </w:t>
+      </w:r>
+      <w:r>
+        <w:rPr>
+          <w:sz w:val="40"/>
+          <w:szCs w:val="40"/>
+          <w:lang w:val="en-IN"/>
+        </w:rPr>
+        <w:t xml:space="preserve">    </w:t>
+      </w:r>
+      <w:r>
+        <w:rPr>
+          <w:sz w:val="40"/>
+          <w:szCs w:val="40"/>
+          <w:lang w:val="en-IN"/>
+        </w:rPr>
+        <w:t>0.65       293</w:t>
+      </w:r>
+    </w:p>
+    <w:p>
+      <w:pPr>
+        <w:ind w:left="720"/>
+        <w:rPr>
+          <w:sz w:val="40"/>
+          <w:szCs w:val="40"/>
+          <w:lang w:val="en-IN"/>
+        </w:rPr>
+      </w:pPr>
+      <w:r>
+        <w:rPr>
+          <w:sz w:val="40"/>
+          <w:szCs w:val="40"/>
+          <w:lang w:val="en-IN"/>
+        </w:rPr>
+        <w:t>ROC-AUC score is also 0.83</w:t>
+      </w:r>
+    </w:p>
+    <w:p>
+      <w:pPr>
+        <w:ind w:left="720"/>
+        <w:rPr>
+          <w:sz w:val="40"/>
+          <w:szCs w:val="40"/>
+          <w:lang w:val="en-IN"/>
+        </w:rPr>
+      </w:pPr>
+    </w:p>
+    <w:p>
+      <w:pPr>
+        <w:ind w:left="720"/>
+        <w:rPr>
+          <w:sz w:val="40"/>
+          <w:szCs w:val="40"/>
+          <w:lang w:val="en-IN"/>
+        </w:rPr>
+      </w:pPr>
+      <w:r>
+        <w:rPr>
+          <w:sz w:val="40"/>
+          <w:szCs w:val="40"/>
+          <w:lang w:val="en-IN"/>
+        </w:rPr>
+        <w:t xml:space="preserve">But, now I have tried to push it more as somewhere I has read, roc auc can go upt0 0.93 for this data. Then Chat-GPT suggested me, you have to focus on recall </w:t>
+      </w:r>
+      <w:r>
+        <w:rPr>
+          <w:sz w:val="40"/>
+          <w:szCs w:val="40"/>
+          <w:lang w:val="en-IN"/>
+        </w:rPr>
+        <w:lastRenderedPageBreak/>
+        <w:t xml:space="preserve">if you want this model to work and solve a problem which benefits business in real world scenario. So, here I can make a decision either to improve the whole model or to focus on top 20% churners. Also, model performance can greatly improve, if we do feature engineering. First, I am going with getting metrics for top 20%, then I will check for feature engineering. </w:t>
+      </w:r>
+    </w:p>
+    <w:p>
+      <w:pPr>
+        <w:ind w:left="720"/>
+        <w:rPr>
+          <w:sz w:val="40"/>
+          <w:szCs w:val="40"/>
+          <w:lang w:val="en-IN"/>
+        </w:rPr>
+      </w:pPr>
+      <w:r>
+        <w:rPr>
+          <w:sz w:val="40"/>
+          <w:szCs w:val="40"/>
+          <w:lang w:val="en-IN"/>
+        </w:rPr>
+        <w:t>One advantage of focusing on 20% customer is to avoid the use of predict which used threshold @ 0.5 by default and I had exploited it and used it’s different value for different model, which makes my all model, non-comparable, against each other.</w:t>
+      </w:r>
+    </w:p>
+    <w:p>
+      <w:pPr>
+        <w:pStyle w:val="ListParagraph"/>
+        <w:ind w:left="1080"/>
         <w:rPr>
           <w:sz w:val="40"/>
           <w:szCs w:val="40"/>
@@ -4083,7 +4310,6 @@
   <w:style w:type="character" w:default="1" w:styleId="DefaultParagraphFont">
     <w:name w:val="Default Paragraph Font"/>
     <w:uiPriority w:val="1"/>
-    <w:semiHidden/>
     <w:unhideWhenUsed/>
   </w:style>
   <w:style w:type="table" w:default="1" w:styleId="TableNormal">

</xml_diff>

<commit_message>
Added the journey till training baseline models
</commit_message>
<xml_diff>
--- a/docs/Project_Documentation.docx
+++ b/docs/Project_Documentation.docx
@@ -1185,7 +1185,27 @@
           <w:lang w:val="en-IN"/>
         </w:rPr>
         <w:lastRenderedPageBreak/>
-        <w:t>Model Training and it’s Outcome</w:t>
+        <w:t xml:space="preserve">Model Training and </w:t>
+      </w:r>
+      <w:proofErr w:type="gramStart"/>
+      <w:r>
+        <w:rPr>
+          <w:sz w:val="72"/>
+          <w:szCs w:val="72"/>
+          <w:u w:val="single"/>
+          <w:lang w:val="en-IN"/>
+        </w:rPr>
+        <w:t>it’s</w:t>
+      </w:r>
+      <w:proofErr w:type="gramEnd"/>
+      <w:r>
+        <w:rPr>
+          <w:sz w:val="72"/>
+          <w:szCs w:val="72"/>
+          <w:u w:val="single"/>
+          <w:lang w:val="en-IN"/>
+        </w:rPr>
+        <w:t xml:space="preserve"> Outcome</w:t>
       </w:r>
     </w:p>
     <w:p>
@@ -1229,7 +1249,25 @@
           <w:szCs w:val="40"/>
           <w:lang w:val="en-IN"/>
         </w:rPr>
-        <w:t>After all the preprocessing, Logistic regression is trained, with a roc-auc score of 0.83, which is fine. But now I will move towards ensemble methods, which are more robust and will give better results.</w:t>
+        <w:t>After all the preprocessing, Logistic regression is trained, with a roc-</w:t>
+      </w:r>
+      <w:proofErr w:type="spellStart"/>
+      <w:r>
+        <w:rPr>
+          <w:sz w:val="40"/>
+          <w:szCs w:val="40"/>
+          <w:lang w:val="en-IN"/>
+        </w:rPr>
+        <w:t>auc</w:t>
+      </w:r>
+      <w:proofErr w:type="spellEnd"/>
+      <w:r>
+        <w:rPr>
+          <w:sz w:val="40"/>
+          <w:szCs w:val="40"/>
+          <w:lang w:val="en-IN"/>
+        </w:rPr>
+        <w:t xml:space="preserve"> score of 0.83, which is fine. But now I will move towards ensemble methods, which are more robust and will give better results.</w:t>
       </w:r>
     </w:p>
     <w:p>
@@ -1281,14 +1319,32 @@
           <w:szCs w:val="40"/>
           <w:lang w:val="en-IN"/>
         </w:rPr>
-        <w:t>Testing of many models is done, and the best model so far get is the XGBoost, which gives me the metrics:</w:t>
-      </w:r>
+        <w:t xml:space="preserve">Testing of many models is done, and the best model so far get is the </w:t>
+      </w:r>
+      <w:proofErr w:type="spellStart"/>
       <w:r>
         <w:rPr>
           <w:sz w:val="40"/>
           <w:szCs w:val="40"/>
           <w:lang w:val="en-IN"/>
         </w:rPr>
+        <w:t>XGBoost</w:t>
+      </w:r>
+      <w:proofErr w:type="spellEnd"/>
+      <w:r>
+        <w:rPr>
+          <w:sz w:val="40"/>
+          <w:szCs w:val="40"/>
+          <w:lang w:val="en-IN"/>
+        </w:rPr>
+        <w:t>, which gives me the metrics:</w:t>
+      </w:r>
+      <w:r>
+        <w:rPr>
+          <w:sz w:val="40"/>
+          <w:szCs w:val="40"/>
+          <w:lang w:val="en-IN"/>
+        </w:rPr>
         <w:br/>
         <w:t xml:space="preserve">              </w:t>
       </w:r>
@@ -1494,20 +1550,48 @@
           <w:lang w:val="en-IN"/>
         </w:rPr>
       </w:pPr>
+      <w:proofErr w:type="gramStart"/>
       <w:r>
         <w:rPr>
           <w:sz w:val="40"/>
           <w:szCs w:val="40"/>
           <w:lang w:val="en-IN"/>
         </w:rPr>
-        <w:t xml:space="preserve">But, now I have tried to push it more as somewhere I has read, roc auc can go upt0 0.93 for this data. Then Chat-GPT suggested me, you have to focus on recall </w:t>
-      </w:r>
+        <w:t>But,</w:t>
+      </w:r>
+      <w:proofErr w:type="gramEnd"/>
       <w:r>
         <w:rPr>
           <w:sz w:val="40"/>
           <w:szCs w:val="40"/>
           <w:lang w:val="en-IN"/>
         </w:rPr>
+        <w:t xml:space="preserve"> now I have tried to push it more as somewhere I has read, roc </w:t>
+      </w:r>
+      <w:proofErr w:type="spellStart"/>
+      <w:r>
+        <w:rPr>
+          <w:sz w:val="40"/>
+          <w:szCs w:val="40"/>
+          <w:lang w:val="en-IN"/>
+        </w:rPr>
+        <w:t>auc</w:t>
+      </w:r>
+      <w:proofErr w:type="spellEnd"/>
+      <w:r>
+        <w:rPr>
+          <w:sz w:val="40"/>
+          <w:szCs w:val="40"/>
+          <w:lang w:val="en-IN"/>
+        </w:rPr>
+        <w:t xml:space="preserve"> can go upt0 0.93 for this data. Then Chat-GPT suggested me, you have to focus on recall </w:t>
+      </w:r>
+      <w:r>
+        <w:rPr>
+          <w:sz w:val="40"/>
+          <w:szCs w:val="40"/>
+          <w:lang w:val="en-IN"/>
+        </w:rPr>
         <w:lastRenderedPageBreak/>
         <w:t xml:space="preserve">if you want this model to work and solve a problem which benefits business in real world scenario. So, here I can make a decision either to improve the whole model or to focus on top 20% churners. Also, model performance can greatly improve, if we do feature engineering. First, I am going with getting metrics for top 20%, then I will check for feature engineering. </w:t>
       </w:r>
@@ -1527,7 +1611,159 @@
           <w:szCs w:val="40"/>
           <w:lang w:val="en-IN"/>
         </w:rPr>
-        <w:t>One advantage of focusing on 20% customer is to avoid the use of predict which used threshold @ 0.5 by default and I had exploited it and used it’s different value for different model, which makes my all model, non-comparable, against each other.</w:t>
+        <w:t xml:space="preserve">One advantage of focusing on 20% customer is to avoid the use of predict which used threshold @ 0.5 by default and I had exploited it and used </w:t>
+      </w:r>
+      <w:r>
+        <w:rPr>
+          <w:sz w:val="40"/>
+          <w:szCs w:val="40"/>
+          <w:lang w:val="en-IN"/>
+        </w:rPr>
+        <w:t>its</w:t>
+      </w:r>
+      <w:r>
+        <w:rPr>
+          <w:sz w:val="40"/>
+          <w:szCs w:val="40"/>
+          <w:lang w:val="en-IN"/>
+        </w:rPr>
+        <w:t xml:space="preserve"> different value for different model, which makes my all model, non-comparable, against each other.</w:t>
+      </w:r>
+    </w:p>
+    <w:p>
+      <w:pPr>
+        <w:ind w:left="720"/>
+        <w:rPr>
+          <w:sz w:val="40"/>
+          <w:szCs w:val="40"/>
+          <w:lang w:val="en-IN"/>
+        </w:rPr>
+      </w:pPr>
+    </w:p>
+    <w:p>
+      <w:pPr>
+        <w:ind w:left="720"/>
+        <w:rPr>
+          <w:sz w:val="40"/>
+          <w:szCs w:val="40"/>
+          <w:lang w:val="en-IN"/>
+        </w:rPr>
+      </w:pPr>
+    </w:p>
+    <w:p>
+      <w:pPr>
+        <w:ind w:left="720"/>
+        <w:rPr>
+          <w:sz w:val="40"/>
+          <w:szCs w:val="40"/>
+          <w:lang w:val="en-IN"/>
+        </w:rPr>
+      </w:pPr>
+      <w:r>
+        <w:rPr>
+          <w:sz w:val="40"/>
+          <w:szCs w:val="40"/>
+          <w:lang w:val="en-IN"/>
+        </w:rPr>
+        <w:t xml:space="preserve">Created 2 functions, </w:t>
+      </w:r>
+      <w:r>
+        <w:rPr>
+          <w:b/>
+          <w:bCs/>
+          <w:sz w:val="40"/>
+          <w:szCs w:val="40"/>
+          <w:lang w:val="en-IN"/>
+        </w:rPr>
+        <w:t>recall 20</w:t>
+      </w:r>
+      <w:r>
+        <w:rPr>
+          <w:sz w:val="40"/>
+          <w:szCs w:val="40"/>
+          <w:lang w:val="en-IN"/>
+        </w:rPr>
+        <w:t xml:space="preserve"> and </w:t>
+      </w:r>
+      <w:r>
+        <w:rPr>
+          <w:b/>
+          <w:bCs/>
+          <w:sz w:val="40"/>
+          <w:szCs w:val="40"/>
+          <w:lang w:val="en-IN"/>
+        </w:rPr>
+        <w:t>precision 20</w:t>
+      </w:r>
+      <w:r>
+        <w:rPr>
+          <w:sz w:val="40"/>
+          <w:szCs w:val="40"/>
+          <w:lang w:val="en-IN"/>
+        </w:rPr>
+        <w:t xml:space="preserve">, which will now serve as a metric for me. F1 score will not be calculated for this scenario because we are now not doing classification, but doing ranking (sorting probabilities in descending order). But F1 score best suits for classification. </w:t>
+      </w:r>
+    </w:p>
+    <w:p>
+      <w:pPr>
+        <w:ind w:left="720"/>
+        <w:rPr>
+          <w:sz w:val="40"/>
+          <w:szCs w:val="40"/>
+          <w:lang w:val="en-IN"/>
+        </w:rPr>
+      </w:pPr>
+      <w:r>
+        <w:rPr>
+          <w:sz w:val="40"/>
+          <w:szCs w:val="40"/>
+          <w:lang w:val="en-IN"/>
+        </w:rPr>
+        <w:t xml:space="preserve">Since the code was redundant, </w:t>
+      </w:r>
+      <w:r>
+        <w:rPr>
+          <w:sz w:val="40"/>
+          <w:szCs w:val="40"/>
+          <w:lang w:val="en-IN"/>
+        </w:rPr>
+        <w:t xml:space="preserve">I converted it to one function </w:t>
+      </w:r>
+      <w:r>
+        <w:rPr>
+          <w:b/>
+          <w:bCs/>
+          <w:sz w:val="40"/>
+          <w:szCs w:val="40"/>
+          <w:lang w:val="en-IN"/>
+        </w:rPr>
+        <w:t xml:space="preserve">precision_recall_20 </w:t>
+      </w:r>
+      <w:r>
+        <w:rPr>
+          <w:sz w:val="40"/>
+          <w:szCs w:val="40"/>
+          <w:lang w:val="en-IN"/>
+        </w:rPr>
+        <w:t>for giving precision and recall.</w:t>
+      </w:r>
+    </w:p>
+    <w:p>
+      <w:pPr>
+        <w:ind w:left="720"/>
+        <w:rPr>
+          <w:sz w:val="40"/>
+          <w:szCs w:val="40"/>
+          <w:lang w:val="en-IN"/>
+        </w:rPr>
+      </w:pPr>
+      <w:r>
+        <w:rPr>
+          <w:sz w:val="40"/>
+          <w:szCs w:val="40"/>
+          <w:lang w:val="en-IN"/>
+        </w:rPr>
+        <w:t xml:space="preserve"> </w:t>
       </w:r>
     </w:p>
     <w:p>

</xml_diff>

<commit_message>
Overwhelmed by the data durinf feature creation, will continue tommorow
</commit_message>
<xml_diff>
--- a/docs/Project_Documentation.docx
+++ b/docs/Project_Documentation.docx
@@ -1747,6 +1747,156 @@
         </w:rPr>
         <w:t>for giving precision and recall.</w:t>
       </w:r>
+    </w:p>
+    <w:p>
+      <w:pPr>
+        <w:ind w:left="720"/>
+        <w:rPr>
+          <w:sz w:val="40"/>
+          <w:szCs w:val="40"/>
+          <w:lang w:val="en-IN"/>
+        </w:rPr>
+      </w:pPr>
+    </w:p>
+    <w:p>
+      <w:pPr>
+        <w:ind w:left="720"/>
+        <w:rPr>
+          <w:sz w:val="40"/>
+          <w:szCs w:val="40"/>
+          <w:lang w:val="en-IN"/>
+        </w:rPr>
+      </w:pPr>
+    </w:p>
+    <w:p>
+      <w:pPr>
+        <w:ind w:left="720"/>
+        <w:rPr>
+          <w:sz w:val="40"/>
+          <w:szCs w:val="40"/>
+          <w:lang w:val="en-IN"/>
+        </w:rPr>
+      </w:pPr>
+      <w:r>
+        <w:rPr>
+          <w:sz w:val="40"/>
+          <w:szCs w:val="40"/>
+          <w:lang w:val="en-IN"/>
+        </w:rPr>
+        <w:lastRenderedPageBreak/>
+        <w:t>After doing ranking based churn prediction, get to know that the features available are weak for predictions, since with 5 models they are giving similar recall @20. So, I have to engineer new features and then test with it.</w:t>
+      </w:r>
+    </w:p>
+    <w:p>
+      <w:pPr>
+        <w:ind w:left="720"/>
+        <w:rPr>
+          <w:b/>
+          <w:bCs/>
+          <w:sz w:val="40"/>
+          <w:szCs w:val="40"/>
+          <w:lang w:val="en-IN"/>
+        </w:rPr>
+      </w:pPr>
+      <w:r>
+        <w:rPr>
+          <w:b/>
+          <w:bCs/>
+          <w:sz w:val="40"/>
+          <w:szCs w:val="40"/>
+          <w:lang w:val="en-IN"/>
+        </w:rPr>
+        <w:t>Create feature ONLY if:</w:t>
+      </w:r>
+    </w:p>
+    <w:p>
+      <w:pPr>
+        <w:numPr>
+          <w:ilvl w:val="0"/>
+          <w:numId w:val="31"/>
+        </w:numPr>
+        <w:rPr>
+          <w:sz w:val="40"/>
+          <w:szCs w:val="40"/>
+          <w:lang w:val="en-IN"/>
+        </w:rPr>
+      </w:pPr>
+      <w:r>
+        <w:rPr>
+          <w:sz w:val="40"/>
+          <w:szCs w:val="40"/>
+          <w:lang w:val="en-IN"/>
+        </w:rPr>
+        <w:t xml:space="preserve">interaction exists </w:t>
+      </w:r>
+    </w:p>
+    <w:p>
+      <w:pPr>
+        <w:numPr>
+          <w:ilvl w:val="0"/>
+          <w:numId w:val="31"/>
+        </w:numPr>
+        <w:rPr>
+          <w:sz w:val="40"/>
+          <w:szCs w:val="40"/>
+          <w:lang w:val="en-IN"/>
+        </w:rPr>
+      </w:pPr>
+      <w:r>
+        <w:rPr>
+          <w:sz w:val="40"/>
+          <w:szCs w:val="40"/>
+          <w:lang w:val="en-IN"/>
+        </w:rPr>
+        <w:t xml:space="preserve">non-linearity exists </w:t>
+      </w:r>
+    </w:p>
+    <w:p>
+      <w:pPr>
+        <w:numPr>
+          <w:ilvl w:val="0"/>
+          <w:numId w:val="31"/>
+        </w:numPr>
+        <w:rPr>
+          <w:sz w:val="40"/>
+          <w:szCs w:val="40"/>
+          <w:lang w:val="en-IN"/>
+        </w:rPr>
+      </w:pPr>
+      <w:r>
+        <w:rPr>
+          <w:sz w:val="40"/>
+          <w:szCs w:val="40"/>
+          <w:lang w:val="en-IN"/>
+        </w:rPr>
+        <w:t xml:space="preserve">hidden </w:t>
+      </w:r>
+      <w:r>
+        <w:rPr>
+          <w:sz w:val="40"/>
+          <w:szCs w:val="40"/>
+          <w:lang w:val="en-IN"/>
+        </w:rPr>
+        <w:t>behaviour</w:t>
+      </w:r>
+      <w:r>
+        <w:rPr>
+          <w:sz w:val="40"/>
+          <w:szCs w:val="40"/>
+          <w:lang w:val="en-IN"/>
+        </w:rPr>
+        <w:t xml:space="preserve"> exists</w:t>
+      </w:r>
+    </w:p>
+    <w:p>
+      <w:pPr>
+        <w:ind w:left="720"/>
+        <w:rPr>
+          <w:sz w:val="40"/>
+          <w:szCs w:val="40"/>
+          <w:lang w:val="en-IN"/>
+        </w:rPr>
+      </w:pPr>
     </w:p>
     <w:p>
       <w:pPr>
@@ -2319,6 +2469,155 @@
     </w:lvl>
   </w:abstractNum>
   <w:abstractNum w:abstractNumId="14" w15:restartNumberingAfterBreak="0">
+    <w:nsid w:val="0DF94355"/>
+    <w:multiLevelType w:val="multilevel"/>
+    <w:tmpl w:val="C28872DE"/>
+    <w:lvl w:ilvl="0">
+      <w:start w:val="1"/>
+      <w:numFmt w:val="bullet"/>
+      <w:lvlText w:val=""/>
+      <w:lvlJc w:val="left"/>
+      <w:pPr>
+        <w:tabs>
+          <w:tab w:val="num" w:pos="720"/>
+        </w:tabs>
+        <w:ind w:left="720" w:hanging="360"/>
+      </w:pPr>
+      <w:rPr>
+        <w:rFonts w:ascii="Symbol" w:hAnsi="Symbol" w:hint="default"/>
+        <w:sz w:val="20"/>
+      </w:rPr>
+    </w:lvl>
+    <w:lvl w:ilvl="1" w:tentative="1">
+      <w:start w:val="1"/>
+      <w:numFmt w:val="bullet"/>
+      <w:lvlText w:val="o"/>
+      <w:lvlJc w:val="left"/>
+      <w:pPr>
+        <w:tabs>
+          <w:tab w:val="num" w:pos="1440"/>
+        </w:tabs>
+        <w:ind w:left="1440" w:hanging="360"/>
+      </w:pPr>
+      <w:rPr>
+        <w:rFonts w:ascii="Courier New" w:hAnsi="Courier New" w:hint="default"/>
+        <w:sz w:val="20"/>
+      </w:rPr>
+    </w:lvl>
+    <w:lvl w:ilvl="2" w:tentative="1">
+      <w:start w:val="1"/>
+      <w:numFmt w:val="bullet"/>
+      <w:lvlText w:val=""/>
+      <w:lvlJc w:val="left"/>
+      <w:pPr>
+        <w:tabs>
+          <w:tab w:val="num" w:pos="2160"/>
+        </w:tabs>
+        <w:ind w:left="2160" w:hanging="360"/>
+      </w:pPr>
+      <w:rPr>
+        <w:rFonts w:ascii="Wingdings" w:hAnsi="Wingdings" w:hint="default"/>
+        <w:sz w:val="20"/>
+      </w:rPr>
+    </w:lvl>
+    <w:lvl w:ilvl="3" w:tentative="1">
+      <w:start w:val="1"/>
+      <w:numFmt w:val="bullet"/>
+      <w:lvlText w:val=""/>
+      <w:lvlJc w:val="left"/>
+      <w:pPr>
+        <w:tabs>
+          <w:tab w:val="num" w:pos="2880"/>
+        </w:tabs>
+        <w:ind w:left="2880" w:hanging="360"/>
+      </w:pPr>
+      <w:rPr>
+        <w:rFonts w:ascii="Wingdings" w:hAnsi="Wingdings" w:hint="default"/>
+        <w:sz w:val="20"/>
+      </w:rPr>
+    </w:lvl>
+    <w:lvl w:ilvl="4" w:tentative="1">
+      <w:start w:val="1"/>
+      <w:numFmt w:val="bullet"/>
+      <w:lvlText w:val=""/>
+      <w:lvlJc w:val="left"/>
+      <w:pPr>
+        <w:tabs>
+          <w:tab w:val="num" w:pos="3600"/>
+        </w:tabs>
+        <w:ind w:left="3600" w:hanging="360"/>
+      </w:pPr>
+      <w:rPr>
+        <w:rFonts w:ascii="Wingdings" w:hAnsi="Wingdings" w:hint="default"/>
+        <w:sz w:val="20"/>
+      </w:rPr>
+    </w:lvl>
+    <w:lvl w:ilvl="5" w:tentative="1">
+      <w:start w:val="1"/>
+      <w:numFmt w:val="bullet"/>
+      <w:lvlText w:val=""/>
+      <w:lvlJc w:val="left"/>
+      <w:pPr>
+        <w:tabs>
+          <w:tab w:val="num" w:pos="4320"/>
+        </w:tabs>
+        <w:ind w:left="4320" w:hanging="360"/>
+      </w:pPr>
+      <w:rPr>
+        <w:rFonts w:ascii="Wingdings" w:hAnsi="Wingdings" w:hint="default"/>
+        <w:sz w:val="20"/>
+      </w:rPr>
+    </w:lvl>
+    <w:lvl w:ilvl="6" w:tentative="1">
+      <w:start w:val="1"/>
+      <w:numFmt w:val="bullet"/>
+      <w:lvlText w:val=""/>
+      <w:lvlJc w:val="left"/>
+      <w:pPr>
+        <w:tabs>
+          <w:tab w:val="num" w:pos="5040"/>
+        </w:tabs>
+        <w:ind w:left="5040" w:hanging="360"/>
+      </w:pPr>
+      <w:rPr>
+        <w:rFonts w:ascii="Wingdings" w:hAnsi="Wingdings" w:hint="default"/>
+        <w:sz w:val="20"/>
+      </w:rPr>
+    </w:lvl>
+    <w:lvl w:ilvl="7" w:tentative="1">
+      <w:start w:val="1"/>
+      <w:numFmt w:val="bullet"/>
+      <w:lvlText w:val=""/>
+      <w:lvlJc w:val="left"/>
+      <w:pPr>
+        <w:tabs>
+          <w:tab w:val="num" w:pos="5760"/>
+        </w:tabs>
+        <w:ind w:left="5760" w:hanging="360"/>
+      </w:pPr>
+      <w:rPr>
+        <w:rFonts w:ascii="Wingdings" w:hAnsi="Wingdings" w:hint="default"/>
+        <w:sz w:val="20"/>
+      </w:rPr>
+    </w:lvl>
+    <w:lvl w:ilvl="8" w:tentative="1">
+      <w:start w:val="1"/>
+      <w:numFmt w:val="bullet"/>
+      <w:lvlText w:val=""/>
+      <w:lvlJc w:val="left"/>
+      <w:pPr>
+        <w:tabs>
+          <w:tab w:val="num" w:pos="6480"/>
+        </w:tabs>
+        <w:ind w:left="6480" w:hanging="360"/>
+      </w:pPr>
+      <w:rPr>
+        <w:rFonts w:ascii="Wingdings" w:hAnsi="Wingdings" w:hint="default"/>
+        <w:sz w:val="20"/>
+      </w:rPr>
+    </w:lvl>
+  </w:abstractNum>
+  <w:abstractNum w:abstractNumId="15" w15:restartNumberingAfterBreak="0">
     <w:nsid w:val="15C5697B"/>
     <w:multiLevelType w:val="multilevel"/>
     <w:tmpl w:val="0409001D"/>
@@ -2404,7 +2703,7 @@
       </w:pPr>
     </w:lvl>
   </w:abstractNum>
-  <w:abstractNum w:abstractNumId="15" w15:restartNumberingAfterBreak="0">
+  <w:abstractNum w:abstractNumId="16" w15:restartNumberingAfterBreak="0">
     <w:nsid w:val="25735712"/>
     <w:multiLevelType w:val="hybridMultilevel"/>
     <w:tmpl w:val="38A8041E"/>
@@ -2517,7 +2816,7 @@
       </w:rPr>
     </w:lvl>
   </w:abstractNum>
-  <w:abstractNum w:abstractNumId="16" w15:restartNumberingAfterBreak="0">
+  <w:abstractNum w:abstractNumId="17" w15:restartNumberingAfterBreak="0">
     <w:nsid w:val="298929E5"/>
     <w:multiLevelType w:val="multilevel"/>
     <w:tmpl w:val="0409001F"/>
@@ -2603,7 +2902,7 @@
       </w:pPr>
     </w:lvl>
   </w:abstractNum>
-  <w:abstractNum w:abstractNumId="17" w15:restartNumberingAfterBreak="0">
+  <w:abstractNum w:abstractNumId="18" w15:restartNumberingAfterBreak="0">
     <w:nsid w:val="2BFB08BF"/>
     <w:multiLevelType w:val="hybridMultilevel"/>
     <w:tmpl w:val="78F4947E"/>
@@ -2716,7 +3015,7 @@
       </w:rPr>
     </w:lvl>
   </w:abstractNum>
-  <w:abstractNum w:abstractNumId="18" w15:restartNumberingAfterBreak="0">
+  <w:abstractNum w:abstractNumId="19" w15:restartNumberingAfterBreak="0">
     <w:nsid w:val="2EDE304E"/>
     <w:multiLevelType w:val="multilevel"/>
     <w:tmpl w:val="0409001D"/>
@@ -2802,7 +3101,7 @@
       </w:pPr>
     </w:lvl>
   </w:abstractNum>
-  <w:abstractNum w:abstractNumId="19" w15:restartNumberingAfterBreak="0">
+  <w:abstractNum w:abstractNumId="20" w15:restartNumberingAfterBreak="0">
     <w:nsid w:val="31AA7D3B"/>
     <w:multiLevelType w:val="hybridMultilevel"/>
     <w:tmpl w:val="3D4E50EE"/>
@@ -2915,7 +3214,7 @@
       </w:rPr>
     </w:lvl>
   </w:abstractNum>
-  <w:abstractNum w:abstractNumId="20" w15:restartNumberingAfterBreak="0">
+  <w:abstractNum w:abstractNumId="21" w15:restartNumberingAfterBreak="0">
     <w:nsid w:val="3AEB0273"/>
     <w:multiLevelType w:val="multilevel"/>
     <w:tmpl w:val="526206A0"/>
@@ -3002,7 +3301,7 @@
       </w:pPr>
     </w:lvl>
   </w:abstractNum>
-  <w:abstractNum w:abstractNumId="21" w15:restartNumberingAfterBreak="0">
+  <w:abstractNum w:abstractNumId="22" w15:restartNumberingAfterBreak="0">
     <w:nsid w:val="43F8503E"/>
     <w:multiLevelType w:val="multilevel"/>
     <w:tmpl w:val="0409001F"/>
@@ -3088,7 +3387,7 @@
       </w:pPr>
     </w:lvl>
   </w:abstractNum>
-  <w:abstractNum w:abstractNumId="22" w15:restartNumberingAfterBreak="0">
+  <w:abstractNum w:abstractNumId="23" w15:restartNumberingAfterBreak="0">
     <w:nsid w:val="484C4F29"/>
     <w:multiLevelType w:val="multilevel"/>
     <w:tmpl w:val="D8061F64"/>
@@ -3175,7 +3474,7 @@
       </w:pPr>
     </w:lvl>
   </w:abstractNum>
-  <w:abstractNum w:abstractNumId="23" w15:restartNumberingAfterBreak="0">
+  <w:abstractNum w:abstractNumId="24" w15:restartNumberingAfterBreak="0">
     <w:nsid w:val="59350CFB"/>
     <w:multiLevelType w:val="multilevel"/>
     <w:tmpl w:val="9DF09F08"/>
@@ -3262,7 +3561,7 @@
       </w:pPr>
     </w:lvl>
   </w:abstractNum>
-  <w:abstractNum w:abstractNumId="24" w15:restartNumberingAfterBreak="0">
+  <w:abstractNum w:abstractNumId="25" w15:restartNumberingAfterBreak="0">
     <w:nsid w:val="5A570C11"/>
     <w:multiLevelType w:val="hybridMultilevel"/>
     <w:tmpl w:val="433E049C"/>
@@ -3375,7 +3674,7 @@
       </w:rPr>
     </w:lvl>
   </w:abstractNum>
-  <w:abstractNum w:abstractNumId="25" w15:restartNumberingAfterBreak="0">
+  <w:abstractNum w:abstractNumId="26" w15:restartNumberingAfterBreak="0">
     <w:nsid w:val="5AA12AAA"/>
     <w:multiLevelType w:val="hybridMultilevel"/>
     <w:tmpl w:val="D21C1568"/>
@@ -3488,7 +3787,7 @@
       </w:rPr>
     </w:lvl>
   </w:abstractNum>
-  <w:abstractNum w:abstractNumId="26" w15:restartNumberingAfterBreak="0">
+  <w:abstractNum w:abstractNumId="27" w15:restartNumberingAfterBreak="0">
     <w:nsid w:val="5DEC6B47"/>
     <w:multiLevelType w:val="multilevel"/>
     <w:tmpl w:val="604E1C0A"/>
@@ -3575,7 +3874,7 @@
       </w:pPr>
     </w:lvl>
   </w:abstractNum>
-  <w:abstractNum w:abstractNumId="27" w15:restartNumberingAfterBreak="0">
+  <w:abstractNum w:abstractNumId="28" w15:restartNumberingAfterBreak="0">
     <w:nsid w:val="623C5A5F"/>
     <w:multiLevelType w:val="hybridMultilevel"/>
     <w:tmpl w:val="53FC498C"/>
@@ -3688,7 +3987,7 @@
       </w:rPr>
     </w:lvl>
   </w:abstractNum>
-  <w:abstractNum w:abstractNumId="28" w15:restartNumberingAfterBreak="0">
+  <w:abstractNum w:abstractNumId="29" w15:restartNumberingAfterBreak="0">
     <w:nsid w:val="6E9514D7"/>
     <w:multiLevelType w:val="multilevel"/>
     <w:tmpl w:val="0409001F"/>
@@ -3774,7 +4073,7 @@
       </w:pPr>
     </w:lvl>
   </w:abstractNum>
-  <w:abstractNum w:abstractNumId="29" w15:restartNumberingAfterBreak="0">
+  <w:abstractNum w:abstractNumId="30" w15:restartNumberingAfterBreak="0">
     <w:nsid w:val="7D8C2C6D"/>
     <w:multiLevelType w:val="multilevel"/>
     <w:tmpl w:val="04090023"/>
@@ -3862,7 +4161,7 @@
     </w:lvl>
   </w:abstractNum>
   <w:num w:numId="1" w16cid:durableId="1512137068">
-    <w:abstractNumId w:val="23"/>
+    <w:abstractNumId w:val="24"/>
   </w:num>
   <w:num w:numId="2" w16cid:durableId="377901402">
     <w:abstractNumId w:val="13"/>
@@ -3871,16 +4170,16 @@
     <w:abstractNumId w:val="10"/>
   </w:num>
   <w:num w:numId="4" w16cid:durableId="1890916904">
-    <w:abstractNumId w:val="28"/>
+    <w:abstractNumId w:val="29"/>
   </w:num>
   <w:num w:numId="5" w16cid:durableId="489563050">
-    <w:abstractNumId w:val="14"/>
+    <w:abstractNumId w:val="15"/>
   </w:num>
   <w:num w:numId="6" w16cid:durableId="507063207">
-    <w:abstractNumId w:val="20"/>
+    <w:abstractNumId w:val="21"/>
   </w:num>
   <w:num w:numId="7" w16cid:durableId="1520311144">
-    <w:abstractNumId w:val="22"/>
+    <w:abstractNumId w:val="23"/>
   </w:num>
   <w:num w:numId="8" w16cid:durableId="1657951427">
     <w:abstractNumId w:val="9"/>
@@ -3913,43 +4212,46 @@
     <w:abstractNumId w:val="0"/>
   </w:num>
   <w:num w:numId="18" w16cid:durableId="1694377997">
-    <w:abstractNumId w:val="16"/>
+    <w:abstractNumId w:val="17"/>
   </w:num>
   <w:num w:numId="19" w16cid:durableId="2011251794">
-    <w:abstractNumId w:val="18"/>
+    <w:abstractNumId w:val="19"/>
   </w:num>
   <w:num w:numId="20" w16cid:durableId="1712073880">
-    <w:abstractNumId w:val="26"/>
+    <w:abstractNumId w:val="27"/>
   </w:num>
   <w:num w:numId="21" w16cid:durableId="1635452601">
-    <w:abstractNumId w:val="21"/>
+    <w:abstractNumId w:val="22"/>
   </w:num>
   <w:num w:numId="22" w16cid:durableId="45880512">
     <w:abstractNumId w:val="12"/>
   </w:num>
   <w:num w:numId="23" w16cid:durableId="1493446580">
-    <w:abstractNumId w:val="29"/>
+    <w:abstractNumId w:val="30"/>
   </w:num>
   <w:num w:numId="24" w16cid:durableId="1172916259">
-    <w:abstractNumId w:val="17"/>
+    <w:abstractNumId w:val="18"/>
   </w:num>
   <w:num w:numId="25" w16cid:durableId="170222993">
-    <w:abstractNumId w:val="15"/>
+    <w:abstractNumId w:val="16"/>
   </w:num>
   <w:num w:numId="26" w16cid:durableId="653486360">
     <w:abstractNumId w:val="11"/>
   </w:num>
   <w:num w:numId="27" w16cid:durableId="993532354">
-    <w:abstractNumId w:val="24"/>
+    <w:abstractNumId w:val="25"/>
   </w:num>
   <w:num w:numId="28" w16cid:durableId="1662614565">
-    <w:abstractNumId w:val="27"/>
+    <w:abstractNumId w:val="28"/>
   </w:num>
   <w:num w:numId="29" w16cid:durableId="1352876667">
-    <w:abstractNumId w:val="19"/>
+    <w:abstractNumId w:val="20"/>
   </w:num>
   <w:num w:numId="30" w16cid:durableId="774137000">
-    <w:abstractNumId w:val="25"/>
+    <w:abstractNumId w:val="26"/>
+  </w:num>
+  <w:num w:numId="31" w16cid:durableId="171726118">
+    <w:abstractNumId w:val="14"/>
   </w:num>
 </w:numbering>
 </file>

</xml_diff>

<commit_message>
Added insights and pther jounrney details to the word file
</commit_message>
<xml_diff>
--- a/docs/Project_Documentation.docx
+++ b/docs/Project_Documentation.docx
@@ -1185,27 +1185,7 @@
           <w:lang w:val="en-IN"/>
         </w:rPr>
         <w:lastRenderedPageBreak/>
-        <w:t xml:space="preserve">Model Training and </w:t>
-      </w:r>
-      <w:proofErr w:type="gramStart"/>
-      <w:r>
-        <w:rPr>
-          <w:sz w:val="72"/>
-          <w:szCs w:val="72"/>
-          <w:u w:val="single"/>
-          <w:lang w:val="en-IN"/>
-        </w:rPr>
-        <w:t>it’s</w:t>
-      </w:r>
-      <w:proofErr w:type="gramEnd"/>
-      <w:r>
-        <w:rPr>
-          <w:sz w:val="72"/>
-          <w:szCs w:val="72"/>
-          <w:u w:val="single"/>
-          <w:lang w:val="en-IN"/>
-        </w:rPr>
-        <w:t xml:space="preserve"> Outcome</w:t>
+        <w:t>Model Training and it’s Outcome</w:t>
       </w:r>
     </w:p>
     <w:p>
@@ -1249,25 +1229,7 @@
           <w:szCs w:val="40"/>
           <w:lang w:val="en-IN"/>
         </w:rPr>
-        <w:t>After all the preprocessing, Logistic regression is trained, with a roc-</w:t>
-      </w:r>
-      <w:proofErr w:type="spellStart"/>
-      <w:r>
-        <w:rPr>
-          <w:sz w:val="40"/>
-          <w:szCs w:val="40"/>
-          <w:lang w:val="en-IN"/>
-        </w:rPr>
-        <w:t>auc</w:t>
-      </w:r>
-      <w:proofErr w:type="spellEnd"/>
-      <w:r>
-        <w:rPr>
-          <w:sz w:val="40"/>
-          <w:szCs w:val="40"/>
-          <w:lang w:val="en-IN"/>
-        </w:rPr>
-        <w:t xml:space="preserve"> score of 0.83, which is fine. But now I will move towards ensemble methods, which are more robust and will give better results.</w:t>
+        <w:t>After all the preprocessing, Logistic regression is trained, with a roc-auc score of 0.83, which is fine. But now I will move towards ensemble methods, which are more robust and will give better results.</w:t>
       </w:r>
     </w:p>
     <w:p>
@@ -1319,25 +1281,7 @@
           <w:szCs w:val="40"/>
           <w:lang w:val="en-IN"/>
         </w:rPr>
-        <w:t xml:space="preserve">Testing of many models is done, and the best model so far get is the </w:t>
-      </w:r>
-      <w:proofErr w:type="spellStart"/>
-      <w:r>
-        <w:rPr>
-          <w:sz w:val="40"/>
-          <w:szCs w:val="40"/>
-          <w:lang w:val="en-IN"/>
-        </w:rPr>
-        <w:t>XGBoost</w:t>
-      </w:r>
-      <w:proofErr w:type="spellEnd"/>
-      <w:r>
-        <w:rPr>
-          <w:sz w:val="40"/>
-          <w:szCs w:val="40"/>
-          <w:lang w:val="en-IN"/>
-        </w:rPr>
-        <w:t>, which gives me the metrics:</w:t>
+        <w:t>Testing of many models is done, and the best model so far get is the XGBoost, which gives me the metrics:</w:t>
       </w:r>
       <w:r>
         <w:rPr>
@@ -1550,41 +1494,13 @@
           <w:lang w:val="en-IN"/>
         </w:rPr>
       </w:pPr>
-      <w:proofErr w:type="gramStart"/>
-      <w:r>
-        <w:rPr>
-          <w:sz w:val="40"/>
-          <w:szCs w:val="40"/>
-          <w:lang w:val="en-IN"/>
-        </w:rPr>
-        <w:t>But,</w:t>
-      </w:r>
-      <w:proofErr w:type="gramEnd"/>
-      <w:r>
-        <w:rPr>
-          <w:sz w:val="40"/>
-          <w:szCs w:val="40"/>
-          <w:lang w:val="en-IN"/>
-        </w:rPr>
-        <w:t xml:space="preserve"> now I have tried to push it more as somewhere I has read, roc </w:t>
-      </w:r>
-      <w:proofErr w:type="spellStart"/>
-      <w:r>
-        <w:rPr>
-          <w:sz w:val="40"/>
-          <w:szCs w:val="40"/>
-          <w:lang w:val="en-IN"/>
-        </w:rPr>
-        <w:t>auc</w:t>
-      </w:r>
-      <w:proofErr w:type="spellEnd"/>
-      <w:r>
-        <w:rPr>
-          <w:sz w:val="40"/>
-          <w:szCs w:val="40"/>
-          <w:lang w:val="en-IN"/>
-        </w:rPr>
-        <w:t xml:space="preserve"> can go upt0 0.93 for this data. Then Chat-GPT suggested me, you have to focus on recall </w:t>
+      <w:r>
+        <w:rPr>
+          <w:sz w:val="40"/>
+          <w:szCs w:val="40"/>
+          <w:lang w:val="en-IN"/>
+        </w:rPr>
+        <w:t xml:space="preserve">But, now I have tried to push it more as somewhere I has read, roc auc can go upt0 0.93 for this data. Then Chat-GPT suggested me, you have to focus on recall </w:t>
       </w:r>
       <w:r>
         <w:rPr>
@@ -1897,6 +1813,52 @@
           <w:lang w:val="en-IN"/>
         </w:rPr>
       </w:pPr>
+    </w:p>
+    <w:p>
+      <w:pPr>
+        <w:ind w:left="720"/>
+        <w:rPr>
+          <w:sz w:val="40"/>
+          <w:szCs w:val="40"/>
+          <w:lang w:val="en-IN"/>
+        </w:rPr>
+      </w:pPr>
+    </w:p>
+    <w:p>
+      <w:pPr>
+        <w:ind w:left="720"/>
+        <w:rPr>
+          <w:sz w:val="40"/>
+          <w:szCs w:val="40"/>
+          <w:lang w:val="en-IN"/>
+        </w:rPr>
+      </w:pPr>
+      <w:r>
+        <w:rPr>
+          <w:sz w:val="40"/>
+          <w:szCs w:val="40"/>
+          <w:lang w:val="en-IN"/>
+        </w:rPr>
+        <w:t>I have tried 2 features, tenure-churn interaction and stability.</w:t>
+      </w:r>
+    </w:p>
+    <w:p>
+      <w:pPr>
+        <w:ind w:left="720"/>
+        <w:rPr>
+          <w:sz w:val="40"/>
+          <w:szCs w:val="40"/>
+          <w:lang w:val="en-IN"/>
+        </w:rPr>
+      </w:pPr>
+      <w:r>
+        <w:rPr>
+          <w:sz w:val="40"/>
+          <w:szCs w:val="40"/>
+          <w:lang w:val="en-IN"/>
+        </w:rPr>
+        <w:t>I also get to know, segmented features are best for random forest.</w:t>
+      </w:r>
     </w:p>
     <w:p>
       <w:pPr>

</xml_diff>

<commit_message>
Updated notes till now
</commit_message>
<xml_diff>
--- a/docs/Project_Documentation.docx
+++ b/docs/Project_Documentation.docx
@@ -1841,6 +1841,14 @@
         </w:rPr>
         <w:t>I have tried 2 features, tenure-churn interaction and stability.</w:t>
       </w:r>
+      <w:r>
+        <w:rPr>
+          <w:sz w:val="40"/>
+          <w:szCs w:val="40"/>
+          <w:lang w:val="en-IN"/>
+        </w:rPr>
+        <w:t xml:space="preserve"> Stability feature, improved the metrics, but not very much.</w:t>
+      </w:r>
     </w:p>
     <w:p>
       <w:pPr>
@@ -1869,6 +1877,192 @@
           <w:lang w:val="en-IN"/>
         </w:rPr>
       </w:pPr>
+    </w:p>
+    <w:p>
+      <w:pPr>
+        <w:ind w:left="720"/>
+        <w:rPr>
+          <w:sz w:val="40"/>
+          <w:szCs w:val="40"/>
+          <w:lang w:val="en-IN"/>
+        </w:rPr>
+      </w:pPr>
+    </w:p>
+    <w:p>
+      <w:pPr>
+        <w:ind w:left="720"/>
+        <w:rPr>
+          <w:sz w:val="40"/>
+          <w:szCs w:val="40"/>
+          <w:lang w:val="en-IN"/>
+        </w:rPr>
+      </w:pPr>
+    </w:p>
+    <w:p>
+      <w:pPr>
+        <w:ind w:left="720"/>
+        <w:rPr>
+          <w:sz w:val="40"/>
+          <w:szCs w:val="40"/>
+          <w:lang w:val="en-IN"/>
+        </w:rPr>
+      </w:pPr>
+    </w:p>
+    <w:p>
+      <w:pPr>
+        <w:ind w:left="720"/>
+        <w:rPr>
+          <w:sz w:val="40"/>
+          <w:szCs w:val="40"/>
+          <w:lang w:val="en-IN"/>
+        </w:rPr>
+      </w:pPr>
+    </w:p>
+    <w:p>
+      <w:pPr>
+        <w:ind w:left="720"/>
+        <w:rPr>
+          <w:sz w:val="40"/>
+          <w:szCs w:val="40"/>
+          <w:lang w:val="en-IN"/>
+        </w:rPr>
+      </w:pPr>
+    </w:p>
+    <w:p>
+      <w:pPr>
+        <w:ind w:left="720"/>
+        <w:rPr>
+          <w:sz w:val="40"/>
+          <w:szCs w:val="40"/>
+          <w:lang w:val="en-IN"/>
+        </w:rPr>
+      </w:pPr>
+    </w:p>
+    <w:p>
+      <w:pPr>
+        <w:ind w:left="720"/>
+        <w:rPr>
+          <w:sz w:val="40"/>
+          <w:szCs w:val="40"/>
+          <w:lang w:val="en-IN"/>
+        </w:rPr>
+      </w:pPr>
+    </w:p>
+    <w:p>
+      <w:pPr>
+        <w:ind w:left="720"/>
+        <w:rPr>
+          <w:sz w:val="40"/>
+          <w:szCs w:val="40"/>
+          <w:lang w:val="en-IN"/>
+        </w:rPr>
+      </w:pPr>
+    </w:p>
+    <w:p>
+      <w:pPr>
+        <w:ind w:left="720"/>
+        <w:rPr>
+          <w:sz w:val="40"/>
+          <w:szCs w:val="40"/>
+          <w:lang w:val="en-IN"/>
+        </w:rPr>
+      </w:pPr>
+    </w:p>
+    <w:p>
+      <w:pPr>
+        <w:ind w:left="720"/>
+        <w:jc w:val="center"/>
+        <w:rPr>
+          <w:b/>
+          <w:bCs/>
+          <w:sz w:val="56"/>
+          <w:szCs w:val="56"/>
+          <w:lang w:val="en-IN"/>
+        </w:rPr>
+      </w:pPr>
+      <w:r>
+        <w:rPr>
+          <w:b/>
+          <w:bCs/>
+          <w:sz w:val="56"/>
+          <w:szCs w:val="56"/>
+          <w:lang w:val="en-IN"/>
+        </w:rPr>
+        <w:lastRenderedPageBreak/>
+        <w:t xml:space="preserve">Making </w:t>
+      </w:r>
+      <w:r>
+        <w:rPr>
+          <w:b/>
+          <w:bCs/>
+          <w:sz w:val="56"/>
+          <w:szCs w:val="56"/>
+          <w:lang w:val="en-IN"/>
+        </w:rPr>
+        <w:t>P</w:t>
+      </w:r>
+      <w:r>
+        <w:rPr>
+          <w:b/>
+          <w:bCs/>
+          <w:sz w:val="56"/>
+          <w:szCs w:val="56"/>
+          <w:lang w:val="en-IN"/>
+        </w:rPr>
+        <w:t>ipeline</w:t>
+      </w:r>
+    </w:p>
+    <w:p>
+      <w:pPr>
+        <w:pStyle w:val="ListParagraph"/>
+        <w:numPr>
+          <w:ilvl w:val="0"/>
+          <w:numId w:val="34"/>
+        </w:numPr>
+        <w:rPr>
+          <w:sz w:val="40"/>
+          <w:szCs w:val="40"/>
+          <w:lang w:val="en-IN"/>
+        </w:rPr>
+      </w:pPr>
+      <w:r>
+        <w:rPr>
+          <w:sz w:val="40"/>
+          <w:szCs w:val="40"/>
+          <w:lang w:val="en-IN"/>
+        </w:rPr>
+        <w:t>scaling for tenure, monthly charges</w:t>
+      </w:r>
+    </w:p>
+    <w:p>
+      <w:pPr>
+        <w:pStyle w:val="ListParagraph"/>
+        <w:numPr>
+          <w:ilvl w:val="0"/>
+          <w:numId w:val="34"/>
+        </w:numPr>
+        <w:rPr>
+          <w:sz w:val="40"/>
+          <w:szCs w:val="40"/>
+          <w:lang w:val="en-IN"/>
+        </w:rPr>
+      </w:pPr>
+      <w:r>
+        <w:rPr>
+          <w:sz w:val="40"/>
+          <w:szCs w:val="40"/>
+          <w:lang w:val="en-IN"/>
+        </w:rPr>
+        <w:t xml:space="preserve">simple binary mapping for </w:t>
+      </w:r>
+      <w:r>
+        <w:rPr>
+          <w:sz w:val="40"/>
+          <w:szCs w:val="40"/>
+          <w:lang w:val="en-IN"/>
+        </w:rPr>
+        <w:t>binary_cols = ["OnlineSecurity", "OnlineBackup", "DeviceProtection","TechSupport", "StreamingTV", "StreamingMovies",</w:t>
+      </w:r>
       <w:r>
         <w:rPr>
           <w:sz w:val="40"/>
@@ -1876,6 +2070,142 @@
           <w:lang w:val="en-IN"/>
         </w:rPr>
         <w:t xml:space="preserve"> </w:t>
+      </w:r>
+      <w:r>
+        <w:rPr>
+          <w:sz w:val="40"/>
+          <w:szCs w:val="40"/>
+          <w:lang w:val="en-IN"/>
+        </w:rPr>
+        <w:t>"MultipleLines", "Partner", "Dependents",</w:t>
+      </w:r>
+      <w:r>
+        <w:rPr>
+          <w:sz w:val="40"/>
+          <w:szCs w:val="40"/>
+          <w:lang w:val="en-IN"/>
+        </w:rPr>
+        <w:t xml:space="preserve"> </w:t>
+      </w:r>
+      <w:r>
+        <w:rPr>
+          <w:sz w:val="40"/>
+          <w:szCs w:val="40"/>
+          <w:lang w:val="en-IN"/>
+        </w:rPr>
+        <w:t>"PhoneService", "PaperlessBilling"</w:t>
+      </w:r>
+      <w:r>
+        <w:rPr>
+          <w:sz w:val="40"/>
+          <w:szCs w:val="40"/>
+          <w:lang w:val="en-IN"/>
+        </w:rPr>
+        <w:t xml:space="preserve"> </w:t>
+      </w:r>
+      <w:r>
+        <w:rPr>
+          <w:sz w:val="40"/>
+          <w:szCs w:val="40"/>
+          <w:lang w:val="en-IN"/>
+        </w:rPr>
+        <w:t>]</w:t>
+      </w:r>
+    </w:p>
+    <w:p>
+      <w:pPr>
+        <w:pStyle w:val="ListParagraph"/>
+        <w:numPr>
+          <w:ilvl w:val="0"/>
+          <w:numId w:val="34"/>
+        </w:numPr>
+        <w:rPr>
+          <w:sz w:val="40"/>
+          <w:szCs w:val="40"/>
+          <w:lang w:val="en-IN"/>
+        </w:rPr>
+      </w:pPr>
+      <w:r>
+        <w:rPr>
+          <w:sz w:val="40"/>
+          <w:szCs w:val="40"/>
+          <w:lang w:val="en-IN"/>
+        </w:rPr>
+        <w:t xml:space="preserve">ohe for </w:t>
+      </w:r>
+      <w:r>
+        <w:rPr>
+          <w:sz w:val="40"/>
+          <w:szCs w:val="40"/>
+          <w:lang w:val="en-IN"/>
+        </w:rPr>
+        <w:t>["InternetService", "PaymentMethod", "gender"]</w:t>
+      </w:r>
+    </w:p>
+    <w:p>
+      <w:pPr>
+        <w:pStyle w:val="ListParagraph"/>
+        <w:numPr>
+          <w:ilvl w:val="0"/>
+          <w:numId w:val="34"/>
+        </w:numPr>
+        <w:rPr>
+          <w:sz w:val="40"/>
+          <w:szCs w:val="40"/>
+          <w:lang w:val="en-IN"/>
+        </w:rPr>
+      </w:pPr>
+      <w:r>
+        <w:rPr>
+          <w:sz w:val="40"/>
+          <w:szCs w:val="40"/>
+          <w:lang w:val="en-IN"/>
+        </w:rPr>
+        <w:t>ordinal encoding for contract</w:t>
+      </w:r>
+    </w:p>
+    <w:p>
+      <w:pPr>
+        <w:pStyle w:val="ListParagraph"/>
+        <w:numPr>
+          <w:ilvl w:val="0"/>
+          <w:numId w:val="34"/>
+        </w:numPr>
+        <w:rPr>
+          <w:sz w:val="40"/>
+          <w:szCs w:val="40"/>
+          <w:lang w:val="en-IN"/>
+        </w:rPr>
+      </w:pPr>
+      <w:r>
+        <w:rPr>
+          <w:sz w:val="40"/>
+          <w:szCs w:val="40"/>
+          <w:lang w:val="en-IN"/>
+        </w:rPr>
+        <w:t>label encoding of custom mapping for target variables.</w:t>
+      </w:r>
+    </w:p>
+    <w:p>
+      <w:pPr>
+        <w:pStyle w:val="ListParagraph"/>
+        <w:numPr>
+          <w:ilvl w:val="0"/>
+          <w:numId w:val="34"/>
+        </w:numPr>
+        <w:rPr>
+          <w:sz w:val="40"/>
+          <w:szCs w:val="40"/>
+          <w:lang w:val="en-IN"/>
+        </w:rPr>
+      </w:pPr>
+      <w:r>
+        <w:rPr>
+          <w:sz w:val="40"/>
+          <w:szCs w:val="40"/>
+          <w:lang w:val="en-IN"/>
+        </w:rPr>
+        <w:t>Senior citizen will not be processed, as it is already binary encoded.</w:t>
       </w:r>
     </w:p>
     <w:p>
@@ -3350,6 +3680,119 @@
     </w:lvl>
   </w:abstractNum>
   <w:abstractNum w:abstractNumId="23" w15:restartNumberingAfterBreak="0">
+    <w:nsid w:val="4512112D"/>
+    <w:multiLevelType w:val="hybridMultilevel"/>
+    <w:tmpl w:val="34A2A06C"/>
+    <w:lvl w:ilvl="0" w:tplc="40090001">
+      <w:start w:val="1"/>
+      <w:numFmt w:val="bullet"/>
+      <w:lvlText w:val=""/>
+      <w:lvlJc w:val="left"/>
+      <w:pPr>
+        <w:ind w:left="2344" w:hanging="360"/>
+      </w:pPr>
+      <w:rPr>
+        <w:rFonts w:ascii="Symbol" w:hAnsi="Symbol" w:hint="default"/>
+      </w:rPr>
+    </w:lvl>
+    <w:lvl w:ilvl="1" w:tplc="40090003" w:tentative="1">
+      <w:start w:val="1"/>
+      <w:numFmt w:val="bullet"/>
+      <w:lvlText w:val="o"/>
+      <w:lvlJc w:val="left"/>
+      <w:pPr>
+        <w:ind w:left="3064" w:hanging="360"/>
+      </w:pPr>
+      <w:rPr>
+        <w:rFonts w:ascii="Courier New" w:hAnsi="Courier New" w:cs="Courier New" w:hint="default"/>
+      </w:rPr>
+    </w:lvl>
+    <w:lvl w:ilvl="2" w:tplc="40090005" w:tentative="1">
+      <w:start w:val="1"/>
+      <w:numFmt w:val="bullet"/>
+      <w:lvlText w:val=""/>
+      <w:lvlJc w:val="left"/>
+      <w:pPr>
+        <w:ind w:left="3784" w:hanging="360"/>
+      </w:pPr>
+      <w:rPr>
+        <w:rFonts w:ascii="Wingdings" w:hAnsi="Wingdings" w:hint="default"/>
+      </w:rPr>
+    </w:lvl>
+    <w:lvl w:ilvl="3" w:tplc="40090001" w:tentative="1">
+      <w:start w:val="1"/>
+      <w:numFmt w:val="bullet"/>
+      <w:lvlText w:val=""/>
+      <w:lvlJc w:val="left"/>
+      <w:pPr>
+        <w:ind w:left="4504" w:hanging="360"/>
+      </w:pPr>
+      <w:rPr>
+        <w:rFonts w:ascii="Symbol" w:hAnsi="Symbol" w:hint="default"/>
+      </w:rPr>
+    </w:lvl>
+    <w:lvl w:ilvl="4" w:tplc="40090003" w:tentative="1">
+      <w:start w:val="1"/>
+      <w:numFmt w:val="bullet"/>
+      <w:lvlText w:val="o"/>
+      <w:lvlJc w:val="left"/>
+      <w:pPr>
+        <w:ind w:left="5224" w:hanging="360"/>
+      </w:pPr>
+      <w:rPr>
+        <w:rFonts w:ascii="Courier New" w:hAnsi="Courier New" w:cs="Courier New" w:hint="default"/>
+      </w:rPr>
+    </w:lvl>
+    <w:lvl w:ilvl="5" w:tplc="40090005" w:tentative="1">
+      <w:start w:val="1"/>
+      <w:numFmt w:val="bullet"/>
+      <w:lvlText w:val=""/>
+      <w:lvlJc w:val="left"/>
+      <w:pPr>
+        <w:ind w:left="5944" w:hanging="360"/>
+      </w:pPr>
+      <w:rPr>
+        <w:rFonts w:ascii="Wingdings" w:hAnsi="Wingdings" w:hint="default"/>
+      </w:rPr>
+    </w:lvl>
+    <w:lvl w:ilvl="6" w:tplc="40090001" w:tentative="1">
+      <w:start w:val="1"/>
+      <w:numFmt w:val="bullet"/>
+      <w:lvlText w:val=""/>
+      <w:lvlJc w:val="left"/>
+      <w:pPr>
+        <w:ind w:left="6664" w:hanging="360"/>
+      </w:pPr>
+      <w:rPr>
+        <w:rFonts w:ascii="Symbol" w:hAnsi="Symbol" w:hint="default"/>
+      </w:rPr>
+    </w:lvl>
+    <w:lvl w:ilvl="7" w:tplc="40090003" w:tentative="1">
+      <w:start w:val="1"/>
+      <w:numFmt w:val="bullet"/>
+      <w:lvlText w:val="o"/>
+      <w:lvlJc w:val="left"/>
+      <w:pPr>
+        <w:ind w:left="7384" w:hanging="360"/>
+      </w:pPr>
+      <w:rPr>
+        <w:rFonts w:ascii="Courier New" w:hAnsi="Courier New" w:cs="Courier New" w:hint="default"/>
+      </w:rPr>
+    </w:lvl>
+    <w:lvl w:ilvl="8" w:tplc="40090005" w:tentative="1">
+      <w:start w:val="1"/>
+      <w:numFmt w:val="bullet"/>
+      <w:lvlText w:val=""/>
+      <w:lvlJc w:val="left"/>
+      <w:pPr>
+        <w:ind w:left="8104" w:hanging="360"/>
+      </w:pPr>
+      <w:rPr>
+        <w:rFonts w:ascii="Wingdings" w:hAnsi="Wingdings" w:hint="default"/>
+      </w:rPr>
+    </w:lvl>
+  </w:abstractNum>
+  <w:abstractNum w:abstractNumId="24" w15:restartNumberingAfterBreak="0">
     <w:nsid w:val="484C4F29"/>
     <w:multiLevelType w:val="multilevel"/>
     <w:tmpl w:val="D8061F64"/>
@@ -3436,7 +3879,7 @@
       </w:pPr>
     </w:lvl>
   </w:abstractNum>
-  <w:abstractNum w:abstractNumId="24" w15:restartNumberingAfterBreak="0">
+  <w:abstractNum w:abstractNumId="25" w15:restartNumberingAfterBreak="0">
     <w:nsid w:val="59350CFB"/>
     <w:multiLevelType w:val="multilevel"/>
     <w:tmpl w:val="9DF09F08"/>
@@ -3523,7 +3966,120 @@
       </w:pPr>
     </w:lvl>
   </w:abstractNum>
-  <w:abstractNum w:abstractNumId="25" w15:restartNumberingAfterBreak="0">
+  <w:abstractNum w:abstractNumId="26" w15:restartNumberingAfterBreak="0">
+    <w:nsid w:val="5A4D7F63"/>
+    <w:multiLevelType w:val="hybridMultilevel"/>
+    <w:tmpl w:val="9942FA56"/>
+    <w:lvl w:ilvl="0" w:tplc="40090001">
+      <w:start w:val="1"/>
+      <w:numFmt w:val="bullet"/>
+      <w:lvlText w:val=""/>
+      <w:lvlJc w:val="left"/>
+      <w:pPr>
+        <w:ind w:left="720" w:hanging="360"/>
+      </w:pPr>
+      <w:rPr>
+        <w:rFonts w:ascii="Symbol" w:hAnsi="Symbol" w:hint="default"/>
+      </w:rPr>
+    </w:lvl>
+    <w:lvl w:ilvl="1" w:tplc="40090003" w:tentative="1">
+      <w:start w:val="1"/>
+      <w:numFmt w:val="bullet"/>
+      <w:lvlText w:val="o"/>
+      <w:lvlJc w:val="left"/>
+      <w:pPr>
+        <w:ind w:left="1440" w:hanging="360"/>
+      </w:pPr>
+      <w:rPr>
+        <w:rFonts w:ascii="Courier New" w:hAnsi="Courier New" w:cs="Courier New" w:hint="default"/>
+      </w:rPr>
+    </w:lvl>
+    <w:lvl w:ilvl="2" w:tplc="40090005" w:tentative="1">
+      <w:start w:val="1"/>
+      <w:numFmt w:val="bullet"/>
+      <w:lvlText w:val=""/>
+      <w:lvlJc w:val="left"/>
+      <w:pPr>
+        <w:ind w:left="2160" w:hanging="360"/>
+      </w:pPr>
+      <w:rPr>
+        <w:rFonts w:ascii="Wingdings" w:hAnsi="Wingdings" w:hint="default"/>
+      </w:rPr>
+    </w:lvl>
+    <w:lvl w:ilvl="3" w:tplc="40090001" w:tentative="1">
+      <w:start w:val="1"/>
+      <w:numFmt w:val="bullet"/>
+      <w:lvlText w:val=""/>
+      <w:lvlJc w:val="left"/>
+      <w:pPr>
+        <w:ind w:left="2880" w:hanging="360"/>
+      </w:pPr>
+      <w:rPr>
+        <w:rFonts w:ascii="Symbol" w:hAnsi="Symbol" w:hint="default"/>
+      </w:rPr>
+    </w:lvl>
+    <w:lvl w:ilvl="4" w:tplc="40090003" w:tentative="1">
+      <w:start w:val="1"/>
+      <w:numFmt w:val="bullet"/>
+      <w:lvlText w:val="o"/>
+      <w:lvlJc w:val="left"/>
+      <w:pPr>
+        <w:ind w:left="3600" w:hanging="360"/>
+      </w:pPr>
+      <w:rPr>
+        <w:rFonts w:ascii="Courier New" w:hAnsi="Courier New" w:cs="Courier New" w:hint="default"/>
+      </w:rPr>
+    </w:lvl>
+    <w:lvl w:ilvl="5" w:tplc="40090005" w:tentative="1">
+      <w:start w:val="1"/>
+      <w:numFmt w:val="bullet"/>
+      <w:lvlText w:val=""/>
+      <w:lvlJc w:val="left"/>
+      <w:pPr>
+        <w:ind w:left="4320" w:hanging="360"/>
+      </w:pPr>
+      <w:rPr>
+        <w:rFonts w:ascii="Wingdings" w:hAnsi="Wingdings" w:hint="default"/>
+      </w:rPr>
+    </w:lvl>
+    <w:lvl w:ilvl="6" w:tplc="40090001" w:tentative="1">
+      <w:start w:val="1"/>
+      <w:numFmt w:val="bullet"/>
+      <w:lvlText w:val=""/>
+      <w:lvlJc w:val="left"/>
+      <w:pPr>
+        <w:ind w:left="5040" w:hanging="360"/>
+      </w:pPr>
+      <w:rPr>
+        <w:rFonts w:ascii="Symbol" w:hAnsi="Symbol" w:hint="default"/>
+      </w:rPr>
+    </w:lvl>
+    <w:lvl w:ilvl="7" w:tplc="40090003" w:tentative="1">
+      <w:start w:val="1"/>
+      <w:numFmt w:val="bullet"/>
+      <w:lvlText w:val="o"/>
+      <w:lvlJc w:val="left"/>
+      <w:pPr>
+        <w:ind w:left="5760" w:hanging="360"/>
+      </w:pPr>
+      <w:rPr>
+        <w:rFonts w:ascii="Courier New" w:hAnsi="Courier New" w:cs="Courier New" w:hint="default"/>
+      </w:rPr>
+    </w:lvl>
+    <w:lvl w:ilvl="8" w:tplc="40090005" w:tentative="1">
+      <w:start w:val="1"/>
+      <w:numFmt w:val="bullet"/>
+      <w:lvlText w:val=""/>
+      <w:lvlJc w:val="left"/>
+      <w:pPr>
+        <w:ind w:left="6480" w:hanging="360"/>
+      </w:pPr>
+      <w:rPr>
+        <w:rFonts w:ascii="Wingdings" w:hAnsi="Wingdings" w:hint="default"/>
+      </w:rPr>
+    </w:lvl>
+  </w:abstractNum>
+  <w:abstractNum w:abstractNumId="27" w15:restartNumberingAfterBreak="0">
     <w:nsid w:val="5A570C11"/>
     <w:multiLevelType w:val="hybridMultilevel"/>
     <w:tmpl w:val="433E049C"/>
@@ -3636,7 +4192,7 @@
       </w:rPr>
     </w:lvl>
   </w:abstractNum>
-  <w:abstractNum w:abstractNumId="26" w15:restartNumberingAfterBreak="0">
+  <w:abstractNum w:abstractNumId="28" w15:restartNumberingAfterBreak="0">
     <w:nsid w:val="5AA12AAA"/>
     <w:multiLevelType w:val="hybridMultilevel"/>
     <w:tmpl w:val="D21C1568"/>
@@ -3749,7 +4305,7 @@
       </w:rPr>
     </w:lvl>
   </w:abstractNum>
-  <w:abstractNum w:abstractNumId="27" w15:restartNumberingAfterBreak="0">
+  <w:abstractNum w:abstractNumId="29" w15:restartNumberingAfterBreak="0">
     <w:nsid w:val="5DEC6B47"/>
     <w:multiLevelType w:val="multilevel"/>
     <w:tmpl w:val="604E1C0A"/>
@@ -3836,7 +4392,7 @@
       </w:pPr>
     </w:lvl>
   </w:abstractNum>
-  <w:abstractNum w:abstractNumId="28" w15:restartNumberingAfterBreak="0">
+  <w:abstractNum w:abstractNumId="30" w15:restartNumberingAfterBreak="0">
     <w:nsid w:val="623C5A5F"/>
     <w:multiLevelType w:val="hybridMultilevel"/>
     <w:tmpl w:val="53FC498C"/>
@@ -3949,7 +4505,7 @@
       </w:rPr>
     </w:lvl>
   </w:abstractNum>
-  <w:abstractNum w:abstractNumId="29" w15:restartNumberingAfterBreak="0">
+  <w:abstractNum w:abstractNumId="31" w15:restartNumberingAfterBreak="0">
     <w:nsid w:val="6E9514D7"/>
     <w:multiLevelType w:val="multilevel"/>
     <w:tmpl w:val="0409001F"/>
@@ -4035,7 +4591,120 @@
       </w:pPr>
     </w:lvl>
   </w:abstractNum>
-  <w:abstractNum w:abstractNumId="30" w15:restartNumberingAfterBreak="0">
+  <w:abstractNum w:abstractNumId="32" w15:restartNumberingAfterBreak="0">
+    <w:nsid w:val="764D3EF2"/>
+    <w:multiLevelType w:val="hybridMultilevel"/>
+    <w:tmpl w:val="F1E0D69C"/>
+    <w:lvl w:ilvl="0" w:tplc="40090001">
+      <w:start w:val="1"/>
+      <w:numFmt w:val="bullet"/>
+      <w:lvlText w:val=""/>
+      <w:lvlJc w:val="left"/>
+      <w:pPr>
+        <w:ind w:left="1440" w:hanging="360"/>
+      </w:pPr>
+      <w:rPr>
+        <w:rFonts w:ascii="Symbol" w:hAnsi="Symbol" w:hint="default"/>
+      </w:rPr>
+    </w:lvl>
+    <w:lvl w:ilvl="1" w:tplc="40090003" w:tentative="1">
+      <w:start w:val="1"/>
+      <w:numFmt w:val="bullet"/>
+      <w:lvlText w:val="o"/>
+      <w:lvlJc w:val="left"/>
+      <w:pPr>
+        <w:ind w:left="2160" w:hanging="360"/>
+      </w:pPr>
+      <w:rPr>
+        <w:rFonts w:ascii="Courier New" w:hAnsi="Courier New" w:cs="Courier New" w:hint="default"/>
+      </w:rPr>
+    </w:lvl>
+    <w:lvl w:ilvl="2" w:tplc="40090005" w:tentative="1">
+      <w:start w:val="1"/>
+      <w:numFmt w:val="bullet"/>
+      <w:lvlText w:val=""/>
+      <w:lvlJc w:val="left"/>
+      <w:pPr>
+        <w:ind w:left="2880" w:hanging="360"/>
+      </w:pPr>
+      <w:rPr>
+        <w:rFonts w:ascii="Wingdings" w:hAnsi="Wingdings" w:hint="default"/>
+      </w:rPr>
+    </w:lvl>
+    <w:lvl w:ilvl="3" w:tplc="40090001" w:tentative="1">
+      <w:start w:val="1"/>
+      <w:numFmt w:val="bullet"/>
+      <w:lvlText w:val=""/>
+      <w:lvlJc w:val="left"/>
+      <w:pPr>
+        <w:ind w:left="3600" w:hanging="360"/>
+      </w:pPr>
+      <w:rPr>
+        <w:rFonts w:ascii="Symbol" w:hAnsi="Symbol" w:hint="default"/>
+      </w:rPr>
+    </w:lvl>
+    <w:lvl w:ilvl="4" w:tplc="40090003" w:tentative="1">
+      <w:start w:val="1"/>
+      <w:numFmt w:val="bullet"/>
+      <w:lvlText w:val="o"/>
+      <w:lvlJc w:val="left"/>
+      <w:pPr>
+        <w:ind w:left="4320" w:hanging="360"/>
+      </w:pPr>
+      <w:rPr>
+        <w:rFonts w:ascii="Courier New" w:hAnsi="Courier New" w:cs="Courier New" w:hint="default"/>
+      </w:rPr>
+    </w:lvl>
+    <w:lvl w:ilvl="5" w:tplc="40090005" w:tentative="1">
+      <w:start w:val="1"/>
+      <w:numFmt w:val="bullet"/>
+      <w:lvlText w:val=""/>
+      <w:lvlJc w:val="left"/>
+      <w:pPr>
+        <w:ind w:left="5040" w:hanging="360"/>
+      </w:pPr>
+      <w:rPr>
+        <w:rFonts w:ascii="Wingdings" w:hAnsi="Wingdings" w:hint="default"/>
+      </w:rPr>
+    </w:lvl>
+    <w:lvl w:ilvl="6" w:tplc="40090001" w:tentative="1">
+      <w:start w:val="1"/>
+      <w:numFmt w:val="bullet"/>
+      <w:lvlText w:val=""/>
+      <w:lvlJc w:val="left"/>
+      <w:pPr>
+        <w:ind w:left="5760" w:hanging="360"/>
+      </w:pPr>
+      <w:rPr>
+        <w:rFonts w:ascii="Symbol" w:hAnsi="Symbol" w:hint="default"/>
+      </w:rPr>
+    </w:lvl>
+    <w:lvl w:ilvl="7" w:tplc="40090003" w:tentative="1">
+      <w:start w:val="1"/>
+      <w:numFmt w:val="bullet"/>
+      <w:lvlText w:val="o"/>
+      <w:lvlJc w:val="left"/>
+      <w:pPr>
+        <w:ind w:left="6480" w:hanging="360"/>
+      </w:pPr>
+      <w:rPr>
+        <w:rFonts w:ascii="Courier New" w:hAnsi="Courier New" w:cs="Courier New" w:hint="default"/>
+      </w:rPr>
+    </w:lvl>
+    <w:lvl w:ilvl="8" w:tplc="40090005" w:tentative="1">
+      <w:start w:val="1"/>
+      <w:numFmt w:val="bullet"/>
+      <w:lvlText w:val=""/>
+      <w:lvlJc w:val="left"/>
+      <w:pPr>
+        <w:ind w:left="7200" w:hanging="360"/>
+      </w:pPr>
+      <w:rPr>
+        <w:rFonts w:ascii="Wingdings" w:hAnsi="Wingdings" w:hint="default"/>
+      </w:rPr>
+    </w:lvl>
+  </w:abstractNum>
+  <w:abstractNum w:abstractNumId="33" w15:restartNumberingAfterBreak="0">
     <w:nsid w:val="7D8C2C6D"/>
     <w:multiLevelType w:val="multilevel"/>
     <w:tmpl w:val="04090023"/>
@@ -4123,7 +4792,7 @@
     </w:lvl>
   </w:abstractNum>
   <w:num w:numId="1" w16cid:durableId="1512137068">
-    <w:abstractNumId w:val="24"/>
+    <w:abstractNumId w:val="25"/>
   </w:num>
   <w:num w:numId="2" w16cid:durableId="377901402">
     <w:abstractNumId w:val="13"/>
@@ -4132,7 +4801,7 @@
     <w:abstractNumId w:val="10"/>
   </w:num>
   <w:num w:numId="4" w16cid:durableId="1890916904">
-    <w:abstractNumId w:val="29"/>
+    <w:abstractNumId w:val="31"/>
   </w:num>
   <w:num w:numId="5" w16cid:durableId="489563050">
     <w:abstractNumId w:val="15"/>
@@ -4141,7 +4810,7 @@
     <w:abstractNumId w:val="21"/>
   </w:num>
   <w:num w:numId="7" w16cid:durableId="1520311144">
-    <w:abstractNumId w:val="23"/>
+    <w:abstractNumId w:val="24"/>
   </w:num>
   <w:num w:numId="8" w16cid:durableId="1657951427">
     <w:abstractNumId w:val="9"/>
@@ -4180,7 +4849,7 @@
     <w:abstractNumId w:val="19"/>
   </w:num>
   <w:num w:numId="20" w16cid:durableId="1712073880">
-    <w:abstractNumId w:val="27"/>
+    <w:abstractNumId w:val="29"/>
   </w:num>
   <w:num w:numId="21" w16cid:durableId="1635452601">
     <w:abstractNumId w:val="22"/>
@@ -4189,7 +4858,7 @@
     <w:abstractNumId w:val="12"/>
   </w:num>
   <w:num w:numId="23" w16cid:durableId="1493446580">
-    <w:abstractNumId w:val="30"/>
+    <w:abstractNumId w:val="33"/>
   </w:num>
   <w:num w:numId="24" w16cid:durableId="1172916259">
     <w:abstractNumId w:val="18"/>
@@ -4201,19 +4870,28 @@
     <w:abstractNumId w:val="11"/>
   </w:num>
   <w:num w:numId="27" w16cid:durableId="993532354">
-    <w:abstractNumId w:val="25"/>
+    <w:abstractNumId w:val="27"/>
   </w:num>
   <w:num w:numId="28" w16cid:durableId="1662614565">
-    <w:abstractNumId w:val="28"/>
+    <w:abstractNumId w:val="30"/>
   </w:num>
   <w:num w:numId="29" w16cid:durableId="1352876667">
     <w:abstractNumId w:val="20"/>
   </w:num>
   <w:num w:numId="30" w16cid:durableId="774137000">
-    <w:abstractNumId w:val="26"/>
+    <w:abstractNumId w:val="28"/>
   </w:num>
   <w:num w:numId="31" w16cid:durableId="171726118">
     <w:abstractNumId w:val="14"/>
+  </w:num>
+  <w:num w:numId="32" w16cid:durableId="565454162">
+    <w:abstractNumId w:val="32"/>
+  </w:num>
+  <w:num w:numId="33" w16cid:durableId="1632975934">
+    <w:abstractNumId w:val="23"/>
+  </w:num>
+  <w:num w:numId="34" w16cid:durableId="1723870206">
+    <w:abstractNumId w:val="26"/>
   </w:num>
 </w:numbering>
 </file>

</xml_diff>